<commit_message>
PoC 1.1: dosar adus la zi (MĂRGĂRITAR M, placa 2.8C, AI-ul propriu, date firmă), drafturi reconstruite
Co-Authored-By: Claude Opus 5.5 <noreply@anthropic.com>

Claude-Session: https://claude.ai/code/session_01Ck8guzeJBknbgPsaU2FiFA
</commit_message>
<xml_diff>
--- a/micul-smecher/investors/poc-1.1/dosar/draft/Anexa_16_Raport_Stiintific_SOUL_DRAFT.docx
+++ b/micul-smecher/investors/poc-1.1/dosar/draft/Anexa_16_Raport_Stiintific_SOUL_DRAFT.docx
@@ -188,6 +188,23 @@
           <w:lang w:val="ro-RO"/>
         </w:rPr>
         <w:t>Date generale ale proiectului</w:t>
+      </w:r>
+    </w:p>
+    <w:p>
+      <w:pPr>
+        <w:spacing w:after="80"/>
+        <w:rPr>
+          <w:lang w:val="ro-RO"/>
+        </w:rPr>
+      </w:pPr>
+      <w:r>
+        <w:rPr>
+          <w:b/>
+          <w:bCs/>
+          <w:color w:val="C00000"/>
+          <w:lang w:val="ro-RO"/>
+        </w:rPr>
+        <w:t xml:space="preserve">DRAFT — NU SE SEMNEAZĂ ȘI NU SE DEPUNE. TRL 3 este declarat, dar se atestă doar după dovada D8 (raportul de laborator TRL 3 pe placa Waveshare 2.8C, experimentele X1–X8 filmate), care e în curs. Poarta de lansare din _build/data.py (D8_DONE) blochează versiunea pentru semnare până atunci.</w:t>
       </w:r>
     </w:p>
     <w:tbl>
@@ -489,23 +506,9 @@
             </w:pPr>
             <w:r>
               <w:rPr>
-                <w:highlight w:val="yellow"/>
-                <w:lang w:val="ro-RO"/>
-              </w:rPr>
-              <w:t xml:space="preserve">[A/Ct: CUI]</w:t>
-            </w:r>
-            <w:r>
-              <w:rPr>
-                <w:lang w:val="ro-RO"/>
-              </w:rPr>
-              <w:t xml:space="preserve"> / </w:t>
-            </w:r>
-            <w:r>
-              <w:rPr>
-                <w:highlight w:val="yellow"/>
-                <w:lang w:val="ro-RO"/>
-              </w:rPr>
-              <w:t xml:space="preserve">[J40/…/…]</w:t>
+                <w:lang w:val="ro-RO"/>
+              </w:rPr>
+              <w:t xml:space="preserve">CUI 53145290 / J2025098748009</w:t>
             </w:r>
           </w:p>
         </w:tc>
@@ -719,7 +722,7 @@
               <w:rPr>
                 <w:lang w:val="ro-RO"/>
               </w:rPr>
-              <w:t xml:space="preserve">TRL 3 (minim obligatoriu conform Ghidului Solicitantului) — dovezile D1–D8, Secțiunea II</w:t>
+              <w:t xml:space="preserve">TRL 3 (minim obligatoriu conform Ghidului Solicitantului) — de atestat după D8 (raportul de laborator pe placa 2.8C, în curs), Secțiunea II</w:t>
             </w:r>
           </w:p>
         </w:tc>
@@ -1331,13 +1334,13 @@
                 <w:highlight w:val="yellow"/>
                 <w:lang w:val="ro-RO"/>
               </w:rPr>
-              <w:t xml:space="preserve">[a) ≥ 5 ani experiență: …; b) ≥ 2 publicații în ultimii 10 ani (DOI): …; c) acreditări/certificări în ultimii 10 ani: …]</w:t>
-            </w:r>
-            <w:r>
-              <w:rPr>
-                <w:lang w:val="ro-RO"/>
-              </w:rPr>
-              <w:t xml:space="preserve"> — CV Europass și dovezi anexate</w:t>
+              <w:t xml:space="preserve">[a) ≥ 5 ani experiență: …; b) ≥ 2 publicații în ultimii 10 ani (DOI): …; c) calificări/acreditări/certificări sau rezultate relevante: …]</w:t>
+            </w:r>
+            <w:r>
+              <w:rPr>
+                <w:lang w:val="ro-RO"/>
+              </w:rPr>
+              <w:t xml:space="preserve"> — CV Europass și dovezi anexate. Criteriul aprobat (Anexa 1 la Decizia CM PR BI nr. 54/29.09.2026): a) + (b) sau c)); ținta sigură, până la ghidul final: a) + b) + c)</w:t>
             </w:r>
           </w:p>
         </w:tc>
@@ -1889,7 +1892,7 @@
         <w:rPr>
           <w:lang w:val="ro-RO"/>
         </w:rPr>
-        <w:t xml:space="preserve"> aceste constrângeri pe un hardware de cost redus (MCU ESP32-S3, fără GPU dedicat), într-o carcasă metalică premium: randarea procedurală fluidă pe un panou RGB fără memorie proprie concurează cu radioul pentru lățimea de bandă PSRAM (H1); tastatura pe un disc de ~70 mm depinde de decodare (H2); independența de cloud cere o arhitectură hibridă verificabilă (H3); aluminiul atenuează semnalul 2,4 GHz (H4); ecranul IPS mare și bateria înlocuibilă concurează pentru volum și energie (H5).</w:t>
+        <w:t xml:space="preserve"> aceste constrângeri pe un hardware de cost redus (MCU ESP32-S3, fără GPU dedicat), într-o carcasă metalică premium: randarea procedurală fluidă pe un panou RGB fără memorie proprie concurează cu radioul pentru lățimea de bandă PSRAM (H1); tastatura pe un disc de ~70 mm depinde de decodare (H2); independența de cloud și de un singur furnizor de AI cere o arhitectură local-first verificabilă, în care AI-ul e al proprietarului și memoria rămâne pe dispozitiv (H3); aluminiul atenuează semnalul 2,4 GHz (H4); ecranul IPS de 2,8″ și bateria înlocuibilă de 1500 mAh concurează pentru volum și energie (H5).</w:t>
       </w:r>
     </w:p>
     <w:p>
@@ -1925,7 +1928,7 @@
         <w:rPr>
           <w:lang w:val="ro-RO"/>
         </w:rPr>
-        <w:t xml:space="preserve"> un dispozitiv de 90 × 103 × 31 mm cu afișaj rotund de 2,8″ integrează (i) un motor de randare SDF optimizat pentru un microcontroler ESP32-S3, (ii) o tastatură QWERTY circulară cu decodare probabilistică, (iii) o arhitectură AI hibridă local-first cu degradare controlată și (iv) o carcasă din aluminiu cu fereastră radio polimerică și baterie înlocuibilă, </w:t>
+        <w:t xml:space="preserve"> un dispozitiv de ~90 × 101 × 31,5 mm cu afișaj rotund de 2,8″ integrează (i) un motor de randare SDF optimizat pentru un microcontroler ESP32-S3, (ii) o tastatură QWERTY circulară cu decodare probabilistică, (iii) o arhitectură local-first în care AI-ul e ales și conectat de proprietar, cu degradare controlată și memorie portabilă pe dispozitiv, și (iv) o carcasă din aluminiu cu fereastră radio polimerică și baterie înlocuibilă, </w:t>
       </w:r>
       <w:r>
         <w:rPr>
@@ -1967,7 +1970,7 @@
         <w:rPr>
           <w:lang w:val="ro-RO"/>
         </w:rPr>
-        <w:t xml:space="preserve"> la tastare, latența vocală </w:t>
+        <w:t xml:space="preserve"> la tastare, latența unui tur AI </w:t>
       </w:r>
       <w:r>
         <w:rPr>
@@ -4782,7 +4785,7 @@
         <w:rPr>
           <w:lang w:val="ro-RO"/>
         </w:rPr>
-        <w:t xml:space="preserve"> firmware embedded (C++17) pentru randare SDF în timp real; tastatură circulară cu decodare probabilistică; arhitectură AI hibridă local-first (parser offline RO/EN + modele de limbaj la alegerea utilizatorului prin tool-calling, conector MCP); flux vocal în timp real (Opus/WebSocket, servere UE); securitate cibernetică EN 18031 (BLE LE Secure Connections, OTA semnat, secure boot). Obiective O1, O3; activități A2, A3, A5; rezultate: firmware SoulOS, serviciul AI, protocoalele și datele de validare (R1, R2, R4).</w:t>
+        <w:t xml:space="preserve"> firmware embedded (C++17) pentru randare SDF în timp real; tastatură circulară cu decodare probabilistică; arhitectură local-first (parser offline RO/EN, comenzi vocale offline EN cu ESP-SR, memorie portabilă pe dispozitiv) în care AI-ul e ales și conectat de proprietar (azi Claude, cu contul/cheia proprie; în curând ChatGPT, cu cheie proprie — în lucru; conector MCP cu OAuth 2.1); SOUL Cloud găzduit în UE; securitate cibernetică EN 18031 (BLE LE Secure Connections, OTA semnat, secure boot). Obiective O1, O3; activități A2, A3, A5; rezultate: firmware SoulOS, SOUL Cloud, protocoalele și datele de validare (R1, R2, R4).</w:t>
       </w:r>
     </w:p>
     <w:p>
@@ -4808,7 +4811,7 @@
         <w:rPr>
           <w:lang w:val="ro-RO"/>
         </w:rPr>
-        <w:t xml:space="preserve"> sistem ciber-fizic integrat — ESP32-S3, afișaj rotund IPS 480×480, touch capacitiv, IMU, microfoane MEMS, PMU, baterie înlocuibilă și antenă BLE/Wi-Fi integrată într-o carcasă CNC din aluminiu cu fereastră radio polimerică. Obiective O2, O3; activități A4, A5; rezultate: PCB propriu, arhitectura electromecanică, măsurătorile RF/energie/EMC (R2, R3).</w:t>
+        <w:t xml:space="preserve"> sistem ciber-fizic integrat — ESP32-S3, afișaj rotund IPS 480×480, touch capacitiv, giroscop/accelerometru, RTC, microfon și difuzor I²S opționale, baterie LiPo 1500 mAh înlocuibilă și antenă BLE/Wi-Fi integrată într-o carcasă CNC din aluminiu cu fereastră radio polimerică. Obiective O2, O3; activități A4, A5; rezultate: PCB propriu, arhitectura electromecanică, măsurătorile RF/energie/EMC (R2, R3).</w:t>
       </w:r>
     </w:p>
     <w:p>
@@ -5169,7 +5172,7 @@
               <w:rPr>
                 <w:lang w:val="ro-RO"/>
               </w:rPr>
-              <w:t xml:space="preserve">Realizarea și validarea în laborator (TRL 4) a modelului integrat SOUL M (afișaj 2,8″ + touch + audio + baterie + AI hibrid)</w:t>
+              <w:t xml:space="preserve">Realizarea și validarea în laborator (TRL 4) a modelului integrat SOUL M (afișaj rotund 2,8″ + touch + IMU + audio opțional + baterie + AI la alegerea proprietarului)</w:t>
             </w:r>
           </w:p>
         </w:tc>
@@ -5201,7 +5204,7 @@
               <w:rPr>
                 <w:lang w:val="ro-RO"/>
               </w:rPr>
-              <w:t xml:space="preserve">fps median ≥ 30 · precizie touch ≥ 97 % · WPM ≥ 15 (N = 6) · succes offline ≥ 90 % · latență vocală p50 ≤ 1,8 s · 8/8 protocoale rulate</w:t>
+              <w:t xml:space="preserve">fps median ≥ 30 · precizie touch ≥ 97 % · WPM ≥ 15 (N = 6) · succes offline ≥ 90 % · latența unui tur AI p50 ≤ 1,8 s · 8/8 protocoale rulate</w:t>
             </w:r>
           </w:p>
         </w:tc>
@@ -5344,7 +5347,7 @@
               <w:rPr>
                 <w:lang w:val="ro-RO"/>
               </w:rPr>
-              <w:t xml:space="preserve">Proiectarea și realizarea a 15 prototipuri pre-serie cu PCB propriu și carcasă CNC din aluminiu cu baterie înlocuibilă</w:t>
+              <w:t xml:space="preserve">Proiectarea și realizarea a 15 prototipuri pre-serie cu PCB propriu și carcasă CNC din aluminiu (forma MĂRGĂRITAR) cu baterie înlocuibilă</w:t>
             </w:r>
           </w:p>
         </w:tc>
@@ -5551,7 +5554,7 @@
               <w:rPr>
                 <w:lang w:val="ro-RO"/>
               </w:rPr>
-              <w:t xml:space="preserve">WPM ≥ 20 și UER ≤ 3 % · latență p50 ≤ 1,5 s / p90 ≤ 2,5 s · succes offline ≥ 90 % · ≥ 99 % sesiuni fără crash · SUS ≥ 75 · 0 depășiri la pre-scan (marjă ≥ 3 dB)</w:t>
+              <w:t xml:space="preserve">WPM ≥ 20 și UER ≤ 3 % · latența unui tur AI p50 ≤ 1,5 s / p90 ≤ 2,5 s · succes offline ≥ 90 % · ≥ 99 % sesiuni fără crash · SUS ≥ 75 · 0 depășiri la pre-scan (marjă ≥ 3 dB)</w:t>
             </w:r>
           </w:p>
         </w:tc>
@@ -5726,7 +5729,7 @@
               <w:rPr>
                 <w:lang w:val="ro-RO"/>
               </w:rPr>
-              <w:t xml:space="preserve">cerere de design EUIPO (≤ L5) · cerere de marcă (≤ L6) · 1 articol OA peer-review trimis (≤ L20) · ≥ 2 acorduri de pilot/distribuție + plan de comercializare (L24)</w:t>
+              <w:t xml:space="preserve">cerere de design EUIPO pentru forma MĂRGĂRITAR depusă înainte de 24.09.2027 (în afara bugetului) · cerere de design pentru elementele noi, nepublicate, din proiect (≤ L18) · cerere de marcă (≤ L6) · 1 articol OA peer-review trimis (≤ L20) · ≥ 2 acorduri de pilot/distribuție + plan de comercializare (L24)</w:t>
             </w:r>
           </w:p>
         </w:tc>
@@ -5849,7 +5852,7 @@
         <w:rPr>
           <w:lang w:val="ro-RO"/>
         </w:rPr>
-        <w:t xml:space="preserve"> — 2 cereri de protecție IP depuse (desen/model industrial UE; marcă UE) + raport de brevetabilitate (L18) · </w:t>
+        <w:t xml:space="preserve"> — 2 cereri de protecție IP depuse în proiect (marcă UE; desen/model industrial UE pentru elementele noi din proiect) + raport de brevetabilitate limitat la soluțiile nepublicate (L18) · </w:t>
       </w:r>
       <w:r>
         <w:rPr>
@@ -5935,7 +5938,7 @@
         <w:rPr>
           <w:lang w:val="ro-RO"/>
         </w:rPr>
-        <w:t xml:space="preserve">. Interfața este un afișaj rotund pe care un motor de randare procedurală (câmpuri de distanță cu semn — SDF — cu anti-aliasing analitic) desenează „ochi” parametrici ce exprimă starea sistemului (ascultă, gândește, așteaptă aprobare, doarme); aceeași suprafață găzduiește o tastatură QWERTY circulară. Comenzile utilizatorului (text, voce, gesturi) sunt transformate într-un </w:t>
+        <w:t xml:space="preserve">. Interfața este un afișaj rotund pe care un motor de randare procedurală (câmpuri de distanță cu semn — SDF — cu anti-aliasing analitic) desenează „ochi” parametrici ce exprimă starea sistemului (ascultă, gândește, așteaptă aprobare, doarme); aceeași suprafață găzduiește o tastatură QWERTY circulară. Comenzile utilizatorului (text, comenzi vocale, gesturi) sunt transformate într-un </w:t>
       </w:r>
       <w:r>
         <w:rPr>
@@ -5949,7 +5952,7 @@
         <w:rPr>
           <w:lang w:val="ro-RO"/>
         </w:rPr>
-        <w:t xml:space="preserve"> cu scheme JSON stricte, executate în trei moduri: fără AI (parser local RO/EN, pe dispozitiv/serverul propriu), cu Claude sau cu ChatGPT (tool-calling). Dacă rețeaua sau cheia API cad, sistemul revine controlat la modul local.</w:t>
+        <w:t xml:space="preserve"> cu scheme JSON stricte, executate fie offline (parser local RO/EN, comenzi vocale offline EN), fie de AI-ul conectat de proprietar (azi Claude, cu contul/cheia proprie, prin tool-calling; în curând ChatGPT, cu cheie proprie — în lucru). SOUL nu include și nu revinde AI. Ce știe SOUL despre proprietar (SOUL Memory) stă pe dispozitiv și se dă oricărui AI conectat; schimbarea AI-ului nu pierde memoria. Dacă rețeaua sau cheia API cad, sistemul revine controlat la modul local.</w:t>
       </w:r>
     </w:p>
     <w:p>
@@ -5991,7 +5994,7 @@
         <w:rPr>
           <w:lang w:val="ro-RO"/>
         </w:rPr>
-        <w:t xml:space="preserve"> ESP32-S3 (WROOM-1, 8 MB PSRAM, 16 MB flash); panou IPS rotund 2,8″ 480×480, controler ST7701, interfață RGB565 paralelă, framebuffer 460 KB în PSRAM, bounce-buffers; touch GT911; IMU QMI8658; RTC PCF85063A; codec ES8311 + ES7210, 2 microfoane MEMS, AEC, amplificator; PMU; celulă Li-ion 2500–3000 mAh pe conector MX1.25 (înlocuibilă).</w:t>
+        <w:t xml:space="preserve"> ESP32-S3R8 (8 MB PSRAM, 16 MB flash; prototipul folosește placa Waveshare ESP32-S3-Touch-LCD-2.8C); panou IPS rotund 2,8″ 480×480 cu touch, controler ST7701, interfață RGB565 paralelă, framebuffer în PSRAM, bounce-buffers; touch GT911; giroscop/accelerometru QMI8658; RTC PCF85063A; buzzer; microfon MEMS I²S + amplificator și difuzor I²S (opționale); celulă LiPo 1500 mAh pe conector MX1.25 (înlocuibilă).</w:t>
       </w:r>
     </w:p>
     <w:p>
@@ -6017,7 +6020,7 @@
         <w:rPr>
           <w:lang w:val="ro-RO"/>
         </w:rPr>
-        <w:t xml:space="preserve"> corp ~90 × 103 × 31 mm, CNC din Al 6061 anodizat; talpă polimerică detașabilă = fereastră radio pentru antena 2,4 GHz; închidere Torx, fără adeziv pe celulă; capsula de încărcare „OU” cu pini pogo.</w:t>
+        <w:t xml:space="preserve"> corp ~90 × 101 × 31,5 mm, forma MĂRGĂRITAR, CNC din Al 6061 sablat și anodizat (5 culori); talpă polimerică detașabilă = fereastră radio pentru antena 2,4 GHz; închidere Torx, fără adeziv pe celulă; capsula de încărcare „OU” cu pini pogo.</w:t>
       </w:r>
     </w:p>
     <w:p>
@@ -6037,13 +6040,13 @@
           <w:bCs/>
           <w:lang w:val="ro-RO"/>
         </w:rPr>
-        <w:t xml:space="preserve">Firmware SoulOS (C++17):</w:t>
+        <w:t xml:space="preserve">Firmware SoulOS (SoulOS 1.8.0, „Alive” 1.9.0 în lucru; C++17):</w:t>
       </w:r>
       <w:r>
         <w:rPr>
           <w:lang w:val="ro-RO"/>
         </w:rPr>
-        <w:t xml:space="preserve"> Canvas SDF, Face/Brain/Personality (24 de reacții procedurale, personalitate derivată din ID-ul cipului), Gestures, Keyboard/TextField/Predictor, TimePicker, Alarms, Shell, ClaudeLink (protocolul Claude Hardware Buddy, BLE securizat), OTA semnat, secure boot; geometria UI independentă de rezoluție (466 → 480 px).</w:t>
+        <w:t xml:space="preserve"> Canvas SDF, ochii vii (120 de designuri, 31 de expresii, rarități; perechea „de naștere” din ID-ul cipului), giroscop, Keyboard/TextField/Predictor, alarme, notițe, hărți/vreme/aplicații, SOUL Memory, comenzi vocale offline EN (ESP-SR), ClaudeLink (protocolul Claude Hardware Buddy, BLE securizat), OTA semnat, secure boot.</w:t>
       </w:r>
     </w:p>
     <w:p>
@@ -6063,13 +6066,13 @@
           <w:bCs/>
           <w:lang w:val="ro-RO"/>
         </w:rPr>
-        <w:t xml:space="preserve">Serviciul AI (Python, servere UE):</w:t>
+        <w:t xml:space="preserve">SOUL Cloud (Python, găzduit în UE) și SOUL Bridge:</w:t>
       </w:r>
       <w:r>
         <w:rPr>
           <w:lang w:val="ro-RO"/>
         </w:rPr>
-        <w:t xml:space="preserve"> `suflet_ai` — acțiuni cu scheme JSON, parser local RO/EN, conector MCP, cheie proprie criptată; poarta vocală Opus/WebSocket (xiaozhi-esp32, MIT, adaptat la servere UE).</w:t>
+        <w:t xml:space="preserve"> împerechere cu chei de dispozitiv, gateway WebSocket, conector MCP cu OAuth 2.1 (Claude), cheie API proprie criptată, export/ștergere GDPR, backup opțional criptat al memoriei; SOUL Cloud doar transmite mesajele, nu plătește și nu revinde AI. SOUL Bridge (open source) duce Claude Code-ul proprietarului, de pe computerul lui, la SOUL.</w:t>
       </w:r>
     </w:p>
     <w:p>
@@ -6091,7 +6094,7 @@
         <w:rPr>
           <w:lang w:val="ro-RO"/>
         </w:rPr>
-        <w:t xml:space="preserve"> notițe, alarme, mementouri, liste, cronometre (offline); aprobări pentru Claude Code/Cowork prin BLE; dialog vocal cu asistentul ales; modul „taste mari” (T9 predictiv, taste de 10,3 × 7,7 mm) și control vocal pentru accesibilitate; informare AI Act art. 50 la prima pornire.</w:t>
+        <w:t xml:space="preserve"> notițe, alarme, mementouri, liste, cronometre (offline); comenzi vocale offline în engleză (pe unitățile cu microfon); aprobări pentru Claude Code/Cowork prin BLE; întrebări către AI-ul proprietarului; hărți și vreme; modul „taste mari” și control vocal pentru accesibilitate; informare AI Act art. 50 la prima pornire.</w:t>
       </w:r>
     </w:p>
     <w:p>
@@ -6420,7 +6423,7 @@
               <w:rPr>
                 <w:lang w:val="ro-RO"/>
               </w:rPr>
-              <w:t xml:space="preserve">≥ 30 fps cu Wi-Fi + BLE active; 24 de reacții procedurale; personalitate derivată din ID-ul cipului</w:t>
+              <w:t xml:space="preserve">≥ 30 fps cu Wi-Fi + BLE active; 120 de designuri de ochi și 31 de expresii; fiecare unitate „se naște” cu o pereche de ochi derivată din ID-ul cipului</w:t>
             </w:r>
           </w:p>
         </w:tc>
@@ -6628,7 +6631,7 @@
               <w:rPr>
                 <w:lang w:val="ro-RO"/>
               </w:rPr>
-              <w:t xml:space="preserve">Arhitectură „un singur set de acțiuni, trei moduri” (fără AI / Claude / ChatGPT), fallback local, conector MCP, cheie proprie criptată</w:t>
+              <w:t xml:space="preserve">Arhitectură „un singur set de acțiuni, AI-ul proprietarului”: offline / Claude (cheia proprie sau conectorul din aplicația Claude, OAuth 2.1 MCP) / ChatGPT (cheie proprie); memorie portabilă pe dispozitiv (SOUL Memory), dată oricărui AI conectat</w:t>
             </w:r>
           </w:p>
         </w:tc>
@@ -6661,7 +6664,7 @@
               <w:rPr>
                 <w:lang w:val="ro-RO"/>
               </w:rPr>
-              <w:t xml:space="preserve">dispozitivele au un singur furnizor, au cloud obligatoriu sau merg doar offline</w:t>
+              <w:t xml:space="preserve">dispozitivele au un singur furnizor, cloud obligatoriu sau abonament la AI-ul producătorului</w:t>
             </w:r>
           </w:p>
         </w:tc>
@@ -6694,7 +6697,7 @@
               <w:rPr>
                 <w:lang w:val="ro-RO"/>
               </w:rPr>
-              <w:t xml:space="preserve">≥ 90 % succes offline; continuitate 100 % la căderea rețelei</w:t>
+              <w:t xml:space="preserve">≥ 90 % succes offline; continuitate 100 % la căderea rețelei; 100 % din memorie păstrată la schimbarea AI-ului</w:t>
             </w:r>
           </w:p>
         </w:tc>
@@ -7105,7 +7108,7 @@
         <w:rPr>
           <w:lang w:val="ro-RO"/>
         </w:rPr>
-        <w:t xml:space="preserve">Nivelul TRL de pornire al proiectului este </w:t>
+        <w:t xml:space="preserve">Nivelul TRL de pornire declarat este </w:t>
       </w:r>
       <w:r>
         <w:rPr>
@@ -7119,7 +7122,7 @@
         <w:rPr>
           <w:lang w:val="ro-RO"/>
         </w:rPr>
-        <w:t xml:space="preserve"> (Anexa 18). Justificare: funcțiile critice ale conceptului SOUL sunt validate analitic și experimental </w:t>
+        <w:t xml:space="preserve"> (Anexa 18), </w:t>
       </w:r>
       <w:r>
         <w:rPr>
@@ -7127,13 +7130,69 @@
           <w:bCs/>
           <w:lang w:val="ro-RO"/>
         </w:rPr>
-        <w:t xml:space="preserve">pe componente separate</w:t>
+        <w:t xml:space="preserve">de atestat după D8</w:t>
       </w:r>
       <w:r>
         <w:rPr>
           <w:lang w:val="ro-RO"/>
         </w:rPr>
-        <w:t xml:space="preserve">, în laborator și în simulare: randarea și logica UI (61/61 teste Unity, simulator), tastatura circulară (prototip web interactiv, model geometric), arhitectura AI hibridă (49/49 teste), geometria și CAD-ul corpului, iar înainte de depunere funcțiile critice sunt măsurate pe placa de dezvoltare SOUL M (experimentele X1–X8). </w:t>
+        <w:t xml:space="preserve">. Anexa 18 cere trecerea de la stadiul „pe hârtie” la stadiul experimental, cu măsurători inițiale de laborator; simularea doar completează experimentul fizic. </w:t>
+      </w:r>
+      <w:r>
+        <w:rPr>
+          <w:b/>
+          <w:bCs/>
+          <w:lang w:val="ro-RO"/>
+        </w:rPr>
+        <w:t xml:space="preserve">Azi</w:t>
+      </w:r>
+      <w:r>
+        <w:rPr>
+          <w:lang w:val="ro-RO"/>
+        </w:rPr>
+        <w:t xml:space="preserve"> avem validarea analitică și verificarea software a funcțiilor critice, pe componente separate: randarea și logica UI (SoulOS 1.8.0, 198+ teste native, simulator), tastatura circulară (SoulOS pe web, model geometric), arhitectura cu AI-ul proprietarului și memoria portabilă (SOUL Cloud, 283 de teste), forma și CAD-ul corpului (D1–D7). </w:t>
+      </w:r>
+      <w:r>
+        <w:rPr>
+          <w:b/>
+          <w:bCs/>
+          <w:lang w:val="ro-RO"/>
+        </w:rPr>
+        <w:t xml:space="preserve">Lipsește</w:t>
+      </w:r>
+      <w:r>
+        <w:rPr>
+          <w:lang w:val="ro-RO"/>
+        </w:rPr>
+        <w:t xml:space="preserve"> măsurarea fizică: nimic nu a rulat încă pe hardware; placa Waveshare 2.8C e comandată, încă netestată. Experimentele X1–X8 pe placa reală (D8) sunt </w:t>
+      </w:r>
+      <w:r>
+        <w:rPr>
+          <w:b/>
+          <w:bCs/>
+          <w:lang w:val="ro-RO"/>
+        </w:rPr>
+        <w:t xml:space="preserve">în curs</w:t>
+      </w:r>
+      <w:r>
+        <w:rPr>
+          <w:lang w:val="ro-RO"/>
+        </w:rPr>
+        <w:t xml:space="preserve">; </w:t>
+      </w:r>
+      <w:r>
+        <w:rPr>
+          <w:b/>
+          <w:bCs/>
+          <w:lang w:val="ro-RO"/>
+        </w:rPr>
+        <w:t xml:space="preserve">raportul nu se semnează de expert și nu se depune până când D8 nu există</w:t>
+      </w:r>
+      <w:r>
+        <w:rPr>
+          <w:lang w:val="ro-RO"/>
+        </w:rPr>
+        <w:t xml:space="preserve">. </w:t>
       </w:r>
       <w:r>
         <w:rPr>
@@ -7147,7 +7206,7 @@
         <w:rPr>
           <w:lang w:val="ro-RO"/>
         </w:rPr>
-        <w:t xml:space="preserve">: componentele nu au fost încă integrate într-un sistem funcțional (audio, baterie, carcasă și AI nu rulează împreună), iar nicio validare de sistem în laborator nu a avut loc.</w:t>
+        <w:t xml:space="preserve">: componentele nu sunt integrate într-un sistem funcțional și nicio validare de sistem în laborator nu a avut loc.</w:t>
       </w:r>
     </w:p>
     <w:p>
@@ -7652,7 +7711,7 @@
               <w:rPr>
                 <w:lang w:val="ro-RO"/>
               </w:rPr>
-              <w:t xml:space="preserve">PARCURS (sept. 2026). Conceptul SOUL a fost formulat și documentat: specificația SoulOS (os/SPEC.md, os/ARCHITECTURE.md), studiile de piață, conformitate și competiție (research 01–11, benchmark de 24 de competitori), modelul geometric al tastaturii (pas = 0,0944·D; taste de 6,7 mm pe Ø70) și alegerea panoului 2,8″ IPS 480×480 (research 12), conceptul de carcasă din aluminiu cu fereastră radio (research 10). Aplicații identificate: aprobări AI, notițe/alarme offline, accesibilitate.</w:t>
+              <w:t xml:space="preserve">PARCURS (sept.–oct. 2026). Conceptul SOUL a fost formulat și documentat: specificația SoulOS (os/SPEC.md, os/ARCHITECTURE.md, os/DESIGN-ALIVE.md), arhitectura conectării AI-ului proprietarului (docs/07) și a memoriei (docs/10), studiile de piață, conformitate și competiție (research 01–11, benchmark de 24 de competitori), modelul geometric al tastaturii (pas = 0,0944·D; taste de 6,7 mm pe Ø70) și alegerea panoului 2,8″ IPS 480×480 (research 12), conceptul de carcasă din aluminiu cu fereastră radio (research 10). Aplicații identificate: aprobări AI, notițe/alarme offline, accesibilitate.</w:t>
             </w:r>
           </w:p>
         </w:tc>
@@ -7825,14 +7884,14 @@
               <w:rPr>
                 <w:lang w:val="ro-RO"/>
               </w:rPr>
-              <w:t xml:space="preserve">TRL DE PORNIRE — ATINS pentru funcțiile critice pe componente separate. Dovezi (detaliate în §2.3): D1 firmware cu 61/61 teste Unity; D2 simulator cu cadre reale; D3 serviciul AI cu 49/49 teste; D4 prototipul web al tastaturii; D5 modelul analitic al tastaturii; D6 CAD parametric; D7 istoric git datat; D8 raportul de laborator TRL 3 pe hardware (X1–X8) — </w:t>
+              <w:t xml:space="preserve">TRL DE PORNIRE — DE ATESTAT DUPĂ D8. Azi: validare analitică și verificare software a funcțiilor critice pe componente separate — D1 firmware SoulOS 1.8.0 cu 198+ teste native; D2 simulator cu cadre reale; D3 SOUL Cloud cu 283 de teste + SOUL Bridge; D4 SoulOS pe web; D5 modelul analitic al tastaturii; D6 forma finală MĂRGĂRITAR (randări, planșe, STL); D7 istoric git datat. Lipsește: D8, raportul de laborator TRL 3 pe placa 2.8C (X1–X8, măsurători fizice filmate) — </w:t>
             </w:r>
             <w:r>
               <w:rPr>
                 <w:highlight w:val="yellow"/>
                 <w:lang w:val="ro-RO"/>
               </w:rPr>
-              <w:t xml:space="preserve">[în curs, se finalizează și se anexează înainte de depunere]</w:t>
+              <w:t xml:space="preserve">[în curs; condiție pentru semnarea expertului și pentru depunere]</w:t>
             </w:r>
             <w:r>
               <w:rPr>
@@ -7992,7 +8051,7 @@
               <w:rPr>
                 <w:lang w:val="ro-RO"/>
               </w:rPr>
-              <w:t xml:space="preserve">PLANIFICAT (L14). A1–A3: modelul de laborator SOUL M integrat (afișaj + touch + audio + baterie + AI hibrid, carcasă SLA) validat prin protocoalele P1–P8 la pragurile O1: fps median ≥ 30 · precizie touch ≥ 97 % · WPM ≥ 15 (N = 6) · succes offline ≥ 90 % · latență vocală p50 ≤ 1,8 s · 8/8 protocoale rulate. Livrabil: R1 Raport TRL 4 (IE2) + decizia go/no-go.</w:t>
+              <w:t xml:space="preserve">PLANIFICAT (L14). A1–A3: modelul de laborator SOUL M integrat (afișaj + touch + IMU + audio + baterie + AI-ul proprietarului, carcasă SLA) validat prin protocoalele P1–P8 la pragurile O1: fps median ≥ 30 · precizie touch ≥ 97 % · WPM ≥ 15 (N = 6) · succes offline ≥ 90 % · latența unui tur AI p50 ≤ 1,8 s · 8/8 protocoale rulate. Livrabil: R1 Raport TRL 4 (IE2) + decizia go/no-go.</w:t>
             </w:r>
           </w:p>
         </w:tc>
@@ -8501,7 +8560,7 @@
               <w:rPr>
                 <w:lang w:val="ro-RO"/>
               </w:rPr>
-              <w:t xml:space="preserve">Firmware „Suflet” + modulele SoulOS v1 (Canvas SDF, Face, Brain, Personality, Gestures, ClaudeLink, Keyboard, TextField, Predictor, TimePicker, Alarms, Shell); 61/61 teste Unity trec pe PC (`pio test -e native`, 25.09.2026; 55 în v1 + 6 pentru geometria 480 px a lui SOUL M); compilează pentru amoled143 / amoled175 / lcd28 (SOUL M) / sim</w:t>
+              <w:t xml:space="preserve">Firmware SoulOS 1.8.0 (lansat 04.10.2026, compilat fără avertismente): motorul ochilor (randare SDF, 120 de designuri, 31 de expresii, fiecare unitate primește o pereche din ID-ul cipului), IMU/giroscop, tastatura circulară, alarme, notițe, hărți/vreme/aplicații, SOUL Memory, comenzi vocale offline EN (ESP-SR), legătura Claude Hardware Buddy (BLE), protocolul SOUL Cloud; 198+ teste native trec pe PC (`pio test -e native`); build-uri `lcd28` (placa 2.8C, SOUL M), `lcd28_voice` și `sim`. Reproiectarea „SoulOS Alive” (aprobată 12.10.2026) e în lucru (1.9.0)</w:t>
             </w:r>
           </w:p>
         </w:tc>
@@ -8533,7 +8592,7 @@
               <w:rPr>
                 <w:lang w:val="ro-RO"/>
               </w:rPr>
-              <w:t xml:space="preserve">2026-09</w:t>
+              <w:t xml:space="preserve">2026-10</w:t>
             </w:r>
           </w:p>
         </w:tc>
@@ -8565,7 +8624,7 @@
               <w:rPr>
                 <w:lang w:val="ro-RO"/>
               </w:rPr>
-              <w:t xml:space="preserve">depozit git, `firmware/` (README); commit b84f714; raport de testare anexat </w:t>
+              <w:t xml:space="preserve">depozit git, `firmware/` (README, PERF.md, BRINGUP.md); commit 95d8465 (1.8.0) </w:t>
             </w:r>
             <w:r>
               <w:rPr>
@@ -8683,7 +8742,7 @@
               <w:rPr>
                 <w:lang w:val="ro-RO"/>
               </w:rPr>
-              <w:t xml:space="preserve">Simulator pe PC care rulează aceleași fișiere ca placa și produce cadrele reale ale motorului (10 clipuri: idle, boop, purr, dizzy, sleep…) + cadre cu tastatura și time-picker-ul, inclusiv la 480 px</w:t>
+              <w:t xml:space="preserve">Simulator pe PC care rulează aceeași bibliotecă `lib/Suflet` ca placa și produce cadrele reale (clipuri: idle, boop, purr, dizzy, sleep…, tastatura, ecranele SoulOS la 480 px) + banc de performanță (`tools/perf_bench.py`: ≈ 30 fps estimat pe toate scenariile [E], de măsurat pe placă)</w:t>
             </w:r>
           </w:p>
         </w:tc>
@@ -8715,7 +8774,7 @@
               <w:rPr>
                 <w:lang w:val="ro-RO"/>
               </w:rPr>
-              <w:t xml:space="preserve">2026-09</w:t>
+              <w:t xml:space="preserve">2026-10</w:t>
             </w:r>
           </w:p>
         </w:tc>
@@ -8747,7 +8806,7 @@
               <w:rPr>
                 <w:lang w:val="ro-RO"/>
               </w:rPr>
-              <w:t xml:space="preserve">`firmware/sim`, `media/` (clipuri MP4/GIF anexate)</w:t>
+              <w:t xml:space="preserve">`firmware/sim`, `firmware/PERF.md`, `media/` (clipuri MP4/GIF anexate)</w:t>
             </w:r>
           </w:p>
         </w:tc>
@@ -8858,7 +8917,7 @@
               <w:rPr>
                 <w:lang w:val="ro-RO"/>
               </w:rPr>
-              <w:t xml:space="preserve">Serviciul AI `suflet_ai` v0.2: 3 moduri (fără AI / Claude / ChatGPT), 8 acțiuni cu scheme JSON stricte, parser local RO/EN, conector MCP, cheie proprie criptată; 49/49 teste pytest trec (25.09.2026)</w:t>
+              <w:t xml:space="preserve">SOUL Cloud: împerechere cu chei de dispozitiv, gateway WebSocket, conector MCP cu OAuth 2.1 (Claude), cheie API proprie criptată, export și ștergere date (GDPR), backup criptat opțional al memoriei; 283 de teste trec; rulat cap-coadă cu simulatorul firmware-ului ca dispozitiv (fără claude.ai real încă). SOUL Bridge: canalul Claude Code de pe computerul proprietarului, open source (MIT). Fără AI inclus (decizia din 03.10.2026)</w:t>
             </w:r>
           </w:p>
         </w:tc>
@@ -8890,7 +8949,7 @@
               <w:rPr>
                 <w:lang w:val="ro-RO"/>
               </w:rPr>
-              <w:t xml:space="preserve">2026-09</w:t>
+              <w:t xml:space="preserve">2026-10</w:t>
             </w:r>
           </w:p>
         </w:tc>
@@ -8922,7 +8981,7 @@
               <w:rPr>
                 <w:lang w:val="ro-RO"/>
               </w:rPr>
-              <w:t xml:space="preserve">`ai/` (README, tests/)</w:t>
+              <w:t xml:space="preserve">`ai/` (README, tests/), `bridge/`, `docs/07-CONNECT-AI.md`, `docs/10-SOUL-MEMORY.md`</w:t>
             </w:r>
           </w:p>
         </w:tc>
@@ -9033,7 +9092,7 @@
               <w:rPr>
                 <w:lang w:val="ro-RO"/>
               </w:rPr>
-              <w:t xml:space="preserve">Prototipul web SoulOS: tastatura rotundă interactivă, testabilă cu utilizatori la scara 70 mm</w:t>
+              <w:t xml:space="preserve">SoulOS pe web: ochii ca interfață, tastatura rotundă interactivă testabilă la scara reală, demo public; reproiectarea „Alive” aprobată 12.10.2026</w:t>
             </w:r>
           </w:p>
         </w:tc>
@@ -9065,7 +9124,7 @@
               <w:rPr>
                 <w:lang w:val="ro-RO"/>
               </w:rPr>
-              <w:t xml:space="preserve">2026-09</w:t>
+              <w:t xml:space="preserve">2026-10</w:t>
             </w:r>
           </w:p>
         </w:tc>
@@ -9097,7 +9156,7 @@
               <w:rPr>
                 <w:lang w:val="ro-RO"/>
               </w:rPr>
-              <w:t xml:space="preserve">`os/index.html`, `os/research/04`, `os/ARCHITECTURE.md`</w:t>
+              <w:t xml:space="preserve">`os/index.html`, `os/DESIGN-ALIVE.md`, `os/ARCHITECTURE.md`</w:t>
             </w:r>
           </w:p>
         </w:tc>
@@ -9383,7 +9442,7 @@
               <w:rPr>
                 <w:lang w:val="ro-RO"/>
               </w:rPr>
-              <w:t xml:space="preserve">CAD parametric (CadQuery), STL/STEP pentru P0, randări v6/v7/M ale corpului de ~90 × 103 × 31 mm din aluminiu</w:t>
+              <w:t xml:space="preserve">Forma finală MĂRGĂRITAR, mărimea M (~90 × 101 × 31,5 mm, aluminiu anodizat, 5 culori): randări v9, planșe tehnice, STL-urile prototipului P0 printabil</w:t>
             </w:r>
           </w:p>
         </w:tc>
@@ -9447,7 +9506,7 @@
               <w:rPr>
                 <w:lang w:val="ro-RO"/>
               </w:rPr>
-              <w:t xml:space="preserve">`prototip/`, `cad/`, `renders/`</w:t>
+              <w:t xml:space="preserve">`renders/v9/`, `blueprints/final/`, `prototip/`</w:t>
             </w:r>
           </w:p>
         </w:tc>
@@ -9733,7 +9792,7 @@
               <w:rPr>
                 <w:lang w:val="ro-RO"/>
               </w:rPr>
-              <w:t xml:space="preserve">Experimentele X1–X8 pe placa Waveshare ESP32-S3-Touch-LCD-2.8C (cumpărată din fonduri proprii, în afara bugetului): port, fps, precizie touch, tastare pilot, parser offline, latență AI, RSSI prin aluminiu, consum</w:t>
+              <w:t xml:space="preserve">Experimentele X1–X8 pe placa Waveshare ESP32-S3-Touch-LCD-2.8C (ESP32-S3R8, 8 MB PSRAM, 16 MB flash; comandată din fonduri proprii, în afara bugetului; încă netestată): bring-up, fps, precizie touch, tastare pilot, comenzi offline, latență AI, RSSI prin aluminiu, consum</w:t>
             </w:r>
           </w:p>
         </w:tc>
@@ -9798,7 +9857,7 @@
               <w:rPr>
                 <w:lang w:val="ro-RO"/>
               </w:rPr>
-              <w:t xml:space="preserve">„Raport de laborator TRL 3 — SOUL M (2.8C)”, datat și semnat, cu loguri, fotografii, video cu marcaj de timp și hash git </w:t>
+              <w:t xml:space="preserve">„Raport de laborator TRL 3 — SOUL M (2.8C)”, datat și semnat, cu loguri, fotografii, video cu marcaj de timp pe placa reală și hash git </w:t>
             </w:r>
             <w:r>
               <w:rPr>
@@ -9830,7 +9889,7 @@
         <w:rPr>
           <w:lang w:val="ro-RO"/>
         </w:rPr>
-        <w:t xml:space="preserve"> placa Waveshare ESP32-S3-Touch-LCD-2.8C (≈ 40 $) + un microfon I²S + un amplificator mic se cumpără din fonduri proprii și </w:t>
+        <w:t xml:space="preserve"> placa Waveshare ESP32-S3-Touch-LCD-2.8C (comandată), bateria LiPo 1500 mAh, un microfon I²S și un amplificator mic se cumpără din fonduri proprii și </w:t>
       </w:r>
       <w:r>
         <w:rPr>
@@ -9844,7 +9903,7 @@
         <w:rPr>
           <w:lang w:val="ro-RO"/>
         </w:rPr>
-        <w:t xml:space="preserve"> (§5.2.1 IV).</w:t>
+        <w:t xml:space="preserve"> (§5.2.1 IV). Fiecare experiment se filmează pe placa reală.</w:t>
       </w:r>
     </w:p>
     <w:tbl>
@@ -10129,7 +10188,7 @@
               <w:rPr>
                 <w:lang w:val="ro-RO"/>
               </w:rPr>
-              <w:t xml:space="preserve">Port pe 2.8C: driver RGB ST7701 (Arduino_GFX `Arduino_RGB_Display`), framebuffer în PSRAM, touch GT911</w:t>
+              <w:t xml:space="preserve">Bring-up pe 2.8C: imaginea SoulOS 1.8.0 încărcată pe placă; ecran ST7701 RGB, touch GT911, IMU QMI8658, RTC, BLE (pașii din BRINGUP.md)</w:t>
             </w:r>
           </w:p>
         </w:tc>
@@ -10162,7 +10221,7 @@
               <w:rPr>
                 <w:lang w:val="ro-RO"/>
               </w:rPr>
-              <w:t xml:space="preserve">build `lcd28` (codul există, compilează; neflash-uit)</w:t>
+              <w:t xml:space="preserve">build `lcd28` (compilează fără avertismente; placa e comandată, încă netestată)</w:t>
             </w:r>
           </w:p>
         </w:tc>
@@ -10195,7 +10254,7 @@
               <w:rPr>
                 <w:lang w:val="ro-RO"/>
               </w:rPr>
-              <w:t xml:space="preserve">firmware rulând pe placă; video</w:t>
+              <w:t xml:space="preserve">firmware rulând pe placa reală; video cu marcaj de timp</w:t>
             </w:r>
           </w:p>
         </w:tc>
@@ -10333,7 +10392,7 @@
               <w:rPr>
                 <w:lang w:val="ro-RO"/>
               </w:rPr>
-              <w:t xml:space="preserve">contor de cadre pe serial, 10 min, cu Wi-Fi oprit/pornit</w:t>
+              <w:t xml:space="preserve">linia `[perf]` pe serial (BRINGUP §5), 10 min, cu Wi-Fi oprit/pornit</w:t>
             </w:r>
           </w:p>
         </w:tc>
@@ -10642,7 +10701,7 @@
               <w:rPr>
                 <w:lang w:val="ro-RO"/>
               </w:rPr>
-              <w:t xml:space="preserve">Tastare pilot pe prototipul web (desktop/tabletă la scara 70 mm) și pe placă</w:t>
+              <w:t xml:space="preserve">Tastare pilot pe SoulOS web (la scara reală) și pe placă</w:t>
             </w:r>
           </w:p>
         </w:tc>
@@ -10813,7 +10872,7 @@
               <w:rPr>
                 <w:lang w:val="ro-RO"/>
               </w:rPr>
-              <w:t xml:space="preserve">Parserul offline pe un corpus de 200 de comenzi RO/EN</w:t>
+              <w:t xml:space="preserve">Comenzile offline: parserul pe un corpus de 200 de comenzi RO/EN + comenzile vocale EN (ESP-SR, build `lcd28_voice`, dacă modulul audio e montat)</w:t>
             </w:r>
           </w:p>
         </w:tc>
@@ -10846,7 +10905,7 @@
               <w:rPr>
                 <w:lang w:val="ro-RO"/>
               </w:rPr>
-              <w:t xml:space="preserve">pytest + script de corpus</w:t>
+              <w:t xml:space="preserve">teste automate + script de corpus; citire cu voce, cameră liniștită</w:t>
             </w:r>
           </w:p>
         </w:tc>
@@ -10984,7 +11043,7 @@
               <w:rPr>
                 <w:lang w:val="ro-RO"/>
               </w:rPr>
-              <w:t xml:space="preserve">Latența unui tur AI (text) cu Claude/OpenAI</w:t>
+              <w:t xml:space="preserve">Latența unui tur AI (text) cu cheia proprie Claude (cont de test cu limită de cost); ChatGPT doar dacă integrarea cu cheie proprie e gata</w:t>
             </w:r>
           </w:p>
         </w:tc>
@@ -11017,7 +11076,7 @@
               <w:rPr>
                 <w:lang w:val="ro-RO"/>
               </w:rPr>
-              <w:t xml:space="preserve">50 de tururi, cronometrare</w:t>
+              <w:t xml:space="preserve">50 de tururi, cronometrare pe dispozitiv</w:t>
             </w:r>
           </w:p>
         </w:tc>
@@ -11155,7 +11214,7 @@
               <w:rPr>
                 <w:lang w:val="ro-RO"/>
               </w:rPr>
-              <w:t xml:space="preserve">Împerecherea BLE cu Claude Desktop Hardware Buddy + RSSI prin plăci de aluminiu (tablă 1,5 mm)</w:t>
+              <w:t xml:space="preserve">Împerecherea BLE cu Claude Desktop (Hardware Buddy) + RSSI prin plăci de aluminiu (tablă 1,5 mm)</w:t>
             </w:r>
           </w:p>
         </w:tc>
@@ -11326,7 +11385,7 @@
               <w:rPr>
                 <w:lang w:val="ro-RO"/>
               </w:rPr>
-              <w:t xml:space="preserve">Consumul plăcii (ecran aprins/stins)</w:t>
+              <w:t xml:space="preserve">Consumul plăcii cu LiPo 1500 mAh (ecran aprins/stins)</w:t>
             </w:r>
           </w:p>
         </w:tc>
@@ -11359,7 +11418,7 @@
               <w:rPr>
                 <w:lang w:val="ro-RO"/>
               </w:rPr>
-              <w:t xml:space="preserve">multimetru USB</w:t>
+              <w:t xml:space="preserve">multimetru USB (BRINGUP §5d)</w:t>
             </w:r>
           </w:p>
         </w:tc>
@@ -11392,7 +11451,7 @@
               <w:rPr>
                 <w:lang w:val="ro-RO"/>
               </w:rPr>
-              <w:t xml:space="preserve">mA (baseline pentru H5)</w:t>
+              <w:t xml:space="preserve">mA (baseline pentru H5; estimarea de pornire: ≈ 177–227 mA treaz, ≈ 35–60 mA cu ecranul stins [E])</w:t>
             </w:r>
           </w:p>
         </w:tc>
@@ -11465,7 +11524,7 @@
         <w:rPr>
           <w:lang w:val="ro-RO"/>
         </w:rPr>
-        <w:t xml:space="preserve"> motorul de randare SDF pentru MCU, geometria și hit-testing-ul tastaturii circulare cu taste de margine „stăpâne” pe bordură, arhitectura „un set de acțiuni, trei moduri”, conceptul de carcasă cu fereastră radio și baterie înlocuibilă. Drepturile asupra acestor rezultate sunt cedate de autor către ARTEMIS prin contract de cesiune </w:t>
+        <w:t xml:space="preserve"> motorul de randare SDF pentru MCU, geometria și hit-testing-ul tastaturii circulare cu taste de margine „stăpâne” pe bordură, arhitectura „un set de acțiuni, AI-ul proprietarului, memoria pe dispozitiv”, conceptul de carcasă cu fereastră radio și baterie înlocuibilă. Drepturile asupra acestor rezultate sunt cedate de autor către ARTEMIS prin contract de cesiune </w:t>
       </w:r>
       <w:r>
         <w:rPr>
@@ -11516,13 +11575,13 @@
           <w:bCs/>
           <w:lang w:val="ro-RO"/>
         </w:rPr>
-        <w:t xml:space="preserve">Demonstrat până la depunere (TRL 3):</w:t>
+        <w:t xml:space="preserve">Demonstrat azi (analitic și software, D1–D7):</w:t>
       </w:r>
       <w:r>
         <w:rPr>
           <w:lang w:val="ro-RO"/>
         </w:rPr>
-        <w:t xml:space="preserve"> funcțiile critice pe componente separate — randarea SDF și logica UI (teste automate + simulator, inclusiv geometria 480 px), tastatura circulară (hit-testing verificat pe fiecare tastă, prototip web), parserul local și cele trei moduri AI (teste automate), modelul geometric și CAD-ul; pe hardware, prin X1–X8: rularea pe placa 2.8C, fps, precizie touch, tastare pilot, parser pe 200 de comenzi, latența unui tur AI text, atenuarea orientativă prin tablă de aluminiu, consumul plăcii.</w:t>
+        <w:t xml:space="preserve"> funcțiile critice pe componente separate — randarea SDF și logica UI (teste automate + simulator, inclusiv geometria 480 px), tastatura circulară (hit-testing verificat pe fiecare tastă, SoulOS pe web), parserul local, conectarea AI-ului proprietarului și memoria (teste automate, rulare cap-coadă cu simulatorul), forma și CAD-ul.</w:t>
       </w:r>
     </w:p>
     <w:p>
@@ -11538,6 +11597,28 @@
           <w:bCs/>
           <w:lang w:val="ro-RO"/>
         </w:rPr>
+        <w:t xml:space="preserve">De demonstrat înainte de depunere (D8 — condiție pentru atestarea TRL 3 și pentru semnare; în curs):</w:t>
+      </w:r>
+      <w:r>
+        <w:rPr>
+          <w:lang w:val="ro-RO"/>
+        </w:rPr>
+        <w:t xml:space="preserve"> X1–X8 pe placa reală 2.8C, filmate — bring-up, fps, precizie touch, tastare pilot, comenzi offline, latența unui tur AI text, atenuarea orientativă prin tablă de aluminiu, consumul plăcii. Până atunci, TRL 3 este declarat, nu atestat.</w:t>
+      </w:r>
+    </w:p>
+    <w:p>
+      <w:pPr>
+        <w:spacing w:after="80"/>
+        <w:rPr>
+          <w:lang w:val="ro-RO"/>
+        </w:rPr>
+      </w:pPr>
+      <w:r>
+        <w:rPr>
+          <w:b/>
+          <w:bCs/>
+          <w:lang w:val="ro-RO"/>
+        </w:rPr>
         <w:t xml:space="preserve">De validat în proiect (TRL 4 → TRL 5):</w:t>
       </w:r>
       <w:r>
@@ -11558,7 +11639,7 @@
         <w:rPr>
           <w:lang w:val="ro-RO"/>
         </w:rPr>
-        <w:t xml:space="preserve"> a tuturor subsistemelor (afișaj, touch, audio cu AEC, baterie/PMU, AI hibrid, voce) — nedemonstrată azi; (2) performanța la </w:t>
+        <w:t xml:space="preserve"> a tuturor subsistemelor (afișaj, touch, IMU, audio, baterie/încărcare, AI-ul proprietarului, memoria, comenzile vocale) — nedemonstrată azi; (2) performanța la </w:t>
       </w:r>
       <w:r>
         <w:rPr>
@@ -11700,7 +11781,7 @@
         <w:rPr>
           <w:lang w:val="ro-RO"/>
         </w:rPr>
-        <w:t xml:space="preserve"> Port RGB/ST7701 cu bounce-buffers și măsurarea fps (P1) la fiecare modificare; integrarea GT911 și calibrarea touch (P2); subsistemul audio I²S cu 2 microfoane și AEC; alimentarea (PMU, baterie 2500–3000 mAh) și modelul de consum (P9); carcasa SLA la scara M; serverul vocal UE; scalarea tastaturii la 480 px. IE1 (L6): modelul rulează integrat, cu primele măsurători P1, P2, P5.</w:t>
+        <w:t xml:space="preserve"> SoulOS pe panoul RGB/ST7701 cu bounce-buffers și măsurarea fps (P1) la fiecare modificare; calibrarea touch GT911 (P2) și a giroscopului; subsistemul audio I²S (microfon + amplificator) și comenzile vocale offline; alimentarea (baterie LiPo 1500 mAh, încărcare în capsula OU) și modelul de consum (P9); carcasa SLA la scara M; SOUL Cloud găzduit în UE (împerechere, conectorul Claude, cheia proprie) și SOUL Memory. IE1 (L6): modelul rulează integrat, cu primele măsurători P1, P2, P5.</w:t>
       </w:r>
     </w:p>
     <w:p>
@@ -11736,7 +11817,7 @@
         <w:rPr>
           <w:lang w:val="ro-RO"/>
         </w:rPr>
-        <w:t xml:space="preserve">: pragurile O1 atinse → go TRL 5; neatinse → alternativele tehnice (randare parțială, fereastră radio mai mare, antenă externă în talpă, server mai aproape/model mai mic) și, dacă nici acestea nu reușesc, Anexa 17.</w:t>
+        <w:t xml:space="preserve">: pragurile O1 atinse → go TRL 5; neatinse → alternativele tehnice (randare parțială, fereastră radio mai mare, antenă externă în talpă, alt model AI ales de proprietar, mai mult somn al ecranului) și, dacă nici acestea nu reușesc, Anexa 17.</w:t>
       </w:r>
     </w:p>
     <w:p>
@@ -11830,7 +11911,7 @@
         <w:rPr>
           <w:lang w:val="ro-RO"/>
         </w:rPr>
-        <w:t xml:space="preserve"> Integrarea se face incremental, cu un singur depozit git și build-uri reproductibile (PlatformIO), astfel încât orice regresie (fps, consum, RF) să fie legată de un commit. Ordinea: afișaj + touch → audio → alimentare → AI/voce → carcasă. Fiecare pas are un test de acceptanță din P1–P9 rulat automat sau semi-automat (log serial, telemetrie).</w:t>
+        <w:t xml:space="preserve"> Integrarea se face incremental, cu un singur depozit git și build-uri reproductibile (PlatformIO), astfel încât orice regresie (fps, consum, RF) să fie legată de un commit. Ordinea: afișaj + touch + IMU → audio → alimentare → AI-ul proprietarului + memoria → carcasă. Fiecare pas are un test de acceptanță din P1–P9 rulat automat sau semi-automat (log serial, telemetrie).</w:t>
       </w:r>
     </w:p>
     <w:p>
@@ -11874,7 +11955,7 @@
         <w:rPr>
           <w:lang w:val="ro-RO"/>
         </w:rPr>
-        <w:t xml:space="preserve"> Unitățile rulează firmware-ul și serverul UE finale, pe rețele Wi-Fi casnice reale, cu zgomot ambiental real, la utilizatori reali din BI (panel cu ≥ 40 % femei, ≥ 3 persoane peste 55 de ani, ≥ 2 persoane cu deficiențe de vedere/motorii). Telemetria opt-in înregistrează fps, crash-uri, comenzi offline reușite, latențe, RSSI/PDR, autonomia. Analiza: mediană, p5/p90, intervale de încredere 95 % (bootstrap), comparație cu baseline-ul TRL 3 și cu pragurile O3; abaterile se explică explicit în raportul TRL 5.</w:t>
+        <w:t xml:space="preserve"> Unitățile rulează firmware-ul SoulOS și SOUL Cloud (UE) finale, cu AI-ul fiecărui participant (contul lui; o cheie de test a proiectului, cu limită de cost, doar pentru cine nu are cont), pe rețele Wi-Fi casnice reale, cu zgomot ambiental real, la utilizatori reali din BI (panel cu ≥ 40 % femei, ≥ 3 persoane peste 55 de ani, ≥ 2 persoane cu deficiențe de vedere/motorii). Telemetria opt-in înregistrează fps, crash-uri, comenzi offline reușite, latențe, RSSI/PDR, autonomia. Analiza: mediană, p5/p90, intervale de încredere 95 % (bootstrap), comparație cu baseline-ul TRL 3 și cu pragurile O3; abaterile se explică explicit în raportul TRL 5.</w:t>
       </w:r>
     </w:p>
     <w:p>
@@ -12205,7 +12286,7 @@
               <w:rPr>
                 <w:lang w:val="ro-RO"/>
               </w:rPr>
-              <w:t xml:space="preserve">contor de cadre în firmware, log serial/telemetrie; 60 min; Wi-Fi + BLE active; 24 de reacții; baseline: X2</w:t>
+              <w:t xml:space="preserve">contor de cadre în firmware, log serial/telemetrie; 60 min; Wi-Fi + BLE active; toate cele 31 de expresii; baseline: X2</w:t>
             </w:r>
           </w:p>
         </w:tc>
@@ -12912,7 +12993,7 @@
               <w:rPr>
                 <w:lang w:val="ro-RO"/>
               </w:rPr>
-              <w:t xml:space="preserve">Succesul offline (H3)</w:t>
+              <w:t xml:space="preserve">Succesul offline (text și voce) (H3)</w:t>
             </w:r>
           </w:p>
         </w:tc>
@@ -12945,7 +13026,7 @@
               <w:rPr>
                 <w:lang w:val="ro-RO"/>
               </w:rPr>
-              <w:t xml:space="preserve">corpus de 200 de comenzi RO/EN (alarme, mementouri, notițe, cronometre, liste), fără internet; baseline: X5</w:t>
+              <w:t xml:space="preserve">corpus de 200 de comenzi RO/EN scrise (alarme, mementouri, notițe, cronometre, liste) + 100 de comenzi vocale EN (ESP-SR, pe unitățile cu microfon), fără internet; baseline: X5</w:t>
             </w:r>
           </w:p>
         </w:tc>
@@ -13097,7 +13178,7 @@
               <w:rPr>
                 <w:lang w:val="ro-RO"/>
               </w:rPr>
-              <w:t xml:space="preserve">Latența vocală end-to-end (H3)</w:t>
+              <w:t xml:space="preserve">Latența unui tur AI end-to-end (H3)</w:t>
             </w:r>
           </w:p>
         </w:tc>
@@ -13130,7 +13211,7 @@
               <w:rPr>
                 <w:lang w:val="ro-RO"/>
               </w:rPr>
-              <w:t xml:space="preserve">de la sfârșitul rostirii la primul sunet; 100 de ture; Wi-Fi casnic; servere UE; baseline: X6 (text)</w:t>
+              <w:t xml:space="preserve">de la trimiterea întrebării pe SOUL la începutul răspunsului pe ecran; 100 de ture; Wi-Fi casnic; AI-ul proprietarului (Claude/ChatGPT), direct cu cheia proprie sau prin SOUL Cloud (UE); baseline: X6</w:t>
             </w:r>
           </w:p>
         </w:tc>
@@ -13282,7 +13363,7 @@
               <w:rPr>
                 <w:lang w:val="ro-RO"/>
               </w:rPr>
-              <w:t xml:space="preserve">Degradarea controlată (H3)</w:t>
+              <w:t xml:space="preserve">Degradarea controlată + portabilitatea memoriei (H3)</w:t>
             </w:r>
           </w:p>
         </w:tc>
@@ -13315,7 +13396,7 @@
               <w:rPr>
                 <w:lang w:val="ro-RO"/>
               </w:rPr>
-              <w:t xml:space="preserve">se taie rețeaua sau cheia API în 50 de scenarii</w:t>
+              <w:t xml:space="preserve">se taie rețeaua sau cheia API în 50 de scenarii; se schimbă AI-ul conectat în 10 scenarii (Claude ↔ ChatGPT ↔ offline)</w:t>
             </w:r>
           </w:p>
         </w:tc>
@@ -13348,7 +13429,7 @@
               <w:rPr>
                 <w:lang w:val="ro-RO"/>
               </w:rPr>
-              <w:t xml:space="preserve">TRL 4: 100 % fără blocare; răspuns local</w:t>
+              <w:t xml:space="preserve">TRL 4: 100 % fără blocare; răspuns local; 100 % din memorie păstrată</w:t>
             </w:r>
           </w:p>
           <w:p>
@@ -13363,7 +13444,7 @@
               <w:rPr>
                 <w:lang w:val="ro-RO"/>
               </w:rPr>
-              <w:t xml:space="preserve">TRL 5: 100 %; ≥ 99 % sesiuni fără crash (telemetrie)</w:t>
+              <w:t xml:space="preserve">TRL 5: 100 %; ≥ 99 % sesiuni fără crash (telemetrie); 100 % din memorie păstrată</w:t>
             </w:r>
           </w:p>
         </w:tc>
@@ -13685,7 +13766,7 @@
               <w:rPr>
                 <w:lang w:val="ro-RO"/>
               </w:rPr>
-              <w:t xml:space="preserve">analizor de consum; profil tipic definit (ecran activ 25 % din timp, 30 de interacțiuni vocale, BLE conectat); standby; baseline: X8</w:t>
+              <w:t xml:space="preserve">analizor de consum; profil tipic definit (ecran activ ~1 h/zi, ecran stins/somn restul zilei, 50 de întrebări AI, BLE conectat); baterie LiPo 1500 mAh; baseline: X8</w:t>
             </w:r>
           </w:p>
         </w:tc>
@@ -13733,7 +13814,7 @@
               <w:rPr>
                 <w:lang w:val="ro-RO"/>
               </w:rPr>
-              <w:t xml:space="preserve">TRL 5: ≥ 24 h în profil tipic; ≥ 7 zile standby</w:t>
+              <w:t xml:space="preserve">TRL 5: ≥ 24 h în profil tipic</w:t>
             </w:r>
           </w:p>
         </w:tc>
@@ -14153,7 +14234,7 @@
         <w:rPr>
           <w:lang w:val="ro-RO"/>
         </w:rPr>
-        <w:t xml:space="preserve">Mediul relevant la TRL 5 (Anexa 18): configurația e „similară aplicației finale în aproape toate aspectele” (PCB propriu, carcasă finală din aluminiu, baterie finală, firmware + server UE) și rulează în condițiile reale de utilizare (locuințe și birouri din BI, rețele Wi-Fi casnice, zgomot ambiental, utilizatori reali), completate cu reproducerea controlată în laborator (cutie ecranată, atenuare calibrată). Diferențele față de produsul final (fără certificare CE, fără ambalaj, fără producție în serie) se analizează explicit în raportul TRL 5.</w:t>
+        <w:t xml:space="preserve">Mediul relevant la TRL 5 (Anexa 18): configurația e „similară aplicației finale în aproape toate aspectele” (PCB propriu, carcasă finală din aluminiu, baterie finală, firmware SoulOS + SOUL Cloud găzduit în UE) și rulează în condițiile reale de utilizare (locuințe și birouri din BI, rețele Wi-Fi casnice, zgomot ambiental, utilizatori reali), completate cu reproducerea controlată în laborator (cutie ecranată, atenuare calibrată). Diferențele față de produsul final (fără certificare CE, fără ambalaj, fără producție în serie) se analizează explicit în raportul TRL 5.</w:t>
       </w:r>
     </w:p>
     <w:p>
@@ -14167,7 +14248,7 @@
         <w:rPr>
           <w:lang w:val="ro-RO"/>
         </w:rPr>
-        <w:t xml:space="preserve">Etică și date: consimțământ informat, telemetrie opt-in, pseudonimizare, ștergerea datelor la final, fără înregistrarea audio brută (GDPR). Informare AI Act art. 50 la prima pornire.</w:t>
+        <w:t xml:space="preserve">Etică și date: consimțământ informat, telemetrie opt-in, pseudonimizare, ștergerea datelor la final, fără înregistrarea audio brută (comenzile vocale offline se recunosc pe dispozitiv), export și ștergere a contului la cerere (GDPR). Informare AI Act art. 50 la prima pornire. Participanții își folosesc propriul AI; produsul nu include AI.</w:t>
       </w:r>
     </w:p>
     <w:p>
@@ -14751,7 +14832,7 @@
               <w:rPr>
                 <w:lang w:val="ro-RO"/>
               </w:rPr>
-              <w:t xml:space="preserve">ESP32-S3R8, IPS 2,8″ 480×480, GT911, IMU, RTC; simulatorul produce cadrele reale ale motorului</w:t>
+              <w:t xml:space="preserve">ESP32-S3R8 (8 MB PSRAM, 16 MB flash), IPS 2,8″ 480×480, GT911, QMI8658, RTC, buzzer; simulatorul produce cadrele reale ale motorului</w:t>
             </w:r>
           </w:p>
         </w:tc>
@@ -14784,7 +14865,7 @@
               <w:rPr>
                 <w:lang w:val="ro-RO"/>
               </w:rPr>
-              <w:t xml:space="preserve">proprii (achiziționate din fonduri proprii, în afara bugetului)</w:t>
+              <w:t xml:space="preserve">proprii (placa comandată din fonduri proprii, în afara bugetului; încă netestată)</w:t>
             </w:r>
           </w:p>
         </w:tc>
@@ -15506,7 +15587,7 @@
               <w:rPr>
                 <w:lang w:val="ro-RO"/>
               </w:rPr>
-              <w:t xml:space="preserve">Git, PlatformIO, KiCad, CadQuery (open-source); SaaS: API AI (LLM/STT/TTS), găzduire UE, CAD (linia 18); corpusuri proprii RO/EN (200 de comenzi, 300 de cuvinte, fraze de tastare)</w:t>
+              <w:t xml:space="preserve">Git, PlatformIO, KiCad, CadQuery (open-source); SaaS: API AI pentru teste (chei cu limită de cost) și CAD (linia 18a); infrastructura cloud de test în UE pentru SOUL Cloud, folosită doar în validare (linia 18b); corpusuri proprii RO/EN (200 de comenzi, 300 de cuvinte, fraze de tastare)</w:t>
             </w:r>
           </w:p>
         </w:tc>
@@ -17413,7 +17494,7 @@
               <w:rPr>
                 <w:lang w:val="ro-RO"/>
               </w:rPr>
-              <w:t xml:space="preserve">Modelul de laborator M integrat: port RGB/ST7701, GT911, audio I2S (2 mic + amplificator), baterie 2500–3000 mAh, carcasă SLA la scara M, flux vocal (xiaozhi-esp32 adaptat + server UE suflet_ai), scalarea tastaturii la 480 px</w:t>
+              <w:t xml:space="preserve">Modelul de laborator M integrat: SoulOS pe ESP32-S3 (panou RGB ST7701 480×480, touch GT911, IMU QMI8658, RTC), audio I²S opțional (microfon MEMS + amplificator + difuzor), baterie LiPo 1500 mAh, carcasă SLA la scara M, comenzi vocale offline EN (ESP-SR), conectarea AI-ului proprietarului (cheie proprie, conectorul Claude prin SOUL Cloud în UE, SOUL Bridge), memoria SOUL Memory pe dispozitiv</w:t>
             </w:r>
           </w:p>
         </w:tc>
@@ -17809,7 +17890,7 @@
               <w:rPr>
                 <w:lang w:val="ro-RO"/>
               </w:rPr>
-              <w:t xml:space="preserve">Prototipul pre-serie: PCB propriu (ESP32-S3-WROOM-1, ST7701, GT911, ES8311/ES7210, PMU, IMU, RTC, pini de încărcare), antenă prin fereastră polimerică, carcasă CNC Al 6061 rev A (3 seturi) și rev B (5 + 15 seturi), baterie înlocuibilă, capsula OU; securitatea EN 18031 (secure boot, OTA semnat)</w:t>
+              <w:t xml:space="preserve">Prototipul pre-serie: PCB propriu (ESP32-S3 cu 8 MB PSRAM, ST7701, GT911, QMI8658, RTC, microfon + amplificator I²S, încărcare, pini pentru capsula OU), antenă prin fereastră polimerică, carcasă CNC Al 6061 anodizată, forma MĂRGĂRITAR, rev A (3 seturi) și rev B (5 + 15 seturi), baterie înlocuibilă, capsula OU; securitatea EN 18031 (secure boot, OTA semnat)</w:t>
             </w:r>
           </w:p>
         </w:tc>
@@ -18007,7 +18088,7 @@
               <w:rPr>
                 <w:lang w:val="ro-RO"/>
               </w:rPr>
-              <w:t xml:space="preserve">Validarea TRL 5 în mediu relevant: 15 unități la 12–15 utilizatori din BI (case, birouri, un living lab), 4 săptămâni, telemetrie opt-in; protocoalele P1–P10; 2 workshop-uri de testare; pre-testare EMC/RF (2 sesiuni)</w:t>
+              <w:t xml:space="preserve">Validarea TRL 5 în mediu relevant: 15 unități la 12–15 utilizatori din BI (case, birouri, un living lab), 4 săptămâni, telemetrie opt-in; fiecare participant folosește modul offline și propriul AI (cont Anthropic/OpenAI propriu; cine nu are cont primește o cheie de test a proiectului cu limită de cost, doar pe durata testului); protocoalele P1–P10; 2 workshop-uri de testare; pre-testare EMC/RF (2 sesiuni)</w:t>
             </w:r>
           </w:p>
         </w:tc>
@@ -18205,7 +18286,7 @@
               <w:rPr>
                 <w:lang w:val="ro-RO"/>
               </w:rPr>
-              <w:t xml:space="preserve">Protecția IP și valorificarea: căutare de anteriorități (L1–L3), design UE (≤ L5), marcă UE (≤ L6), evaluarea brevetabilității/modelului de utilitate (L12–L18); customer discovery (≥ 30 de interviuri), transformarea scrisorilor de intenție în acorduri, planul de comercializare</w:t>
+              <w:t xml:space="preserve">Protecția IP și valorificarea: căutare de anteriorități (L1–L3), marcă UE (≤ L6), design UE pentru elementele noi din proiect (≤ L18; forma MĂRGĂRITAR, deja publică, se depune înainte de 24.09.2027, în afara bugetului), evaluarea brevetabilității doar pentru soluțiile nepublicate (L12–L18); customer discovery (≥ 30 de interviuri), transformarea scrisorilor de intenție în acorduri, planul de comercializare</w:t>
             </w:r>
           </w:p>
         </w:tc>
@@ -18333,7 +18414,7 @@
               <w:rPr>
                 <w:lang w:val="ro-RO"/>
               </w:rPr>
-              <w:t xml:space="preserve">cereri EUIPO depuse (≤ L5/L6); ≥ 2 acorduri (L24)</w:t>
+              <w:t xml:space="preserve">cereri EUIPO depuse (marcă ≤ L6, design elemente noi ≤ L18); ≥ 2 acorduri (L24)</w:t>
             </w:r>
           </w:p>
         </w:tc>
@@ -18403,7 +18484,7 @@
               <w:rPr>
                 <w:lang w:val="ro-RO"/>
               </w:rPr>
-              <w:t xml:space="preserve">Diseminare: manuscris (după depunerea IP), trimitere la o revistă OA peer-review (≤ L20), preprint în repozitoriu OA (Zenodo), prezentare la o conferință/târg, demo public</w:t>
+              <w:t xml:space="preserve">Diseminare: manuscris (după depunerea cererilor IP pentru elementele nepublicate), trimitere la o revistă OA peer-review (≤ L20), preprint în repozitoriu OA (Zenodo), prezentare la o conferință/târg, demo public</w:t>
             </w:r>
           </w:p>
         </w:tc>
@@ -26073,7 +26154,7 @@
         <w:rPr>
           <w:lang w:val="ro-RO"/>
         </w:rPr>
-        <w:t xml:space="preserve">Dependențe: A2 depinde de M1 (L3). A3 depinde de L2.1. Rev B și lotul de 15 din A4 depind de poarta IE2 (L14). A5 depinde de M3 (L17). Manuscrisul din A7 se trimite după depunerea cererilor IP (A6).</w:t>
+        <w:t xml:space="preserve">Dependențe: A2 depinde de M1 (L3). A3 depinde de L2.1. Rev B și lotul de 15 din A4 depind de poarta IE2 (L14). A5 depinde de M3 (L17). Manuscrisul din A7 se trimite după depunerea cererilor IP pentru elementele nepublicate (A6).</w:t>
       </w:r>
     </w:p>
     <w:p>
@@ -27189,7 +27270,7 @@
               <w:rPr>
                 <w:lang w:val="ro-RO"/>
               </w:rPr>
-              <w:t xml:space="preserve">Achiziții (L4, L15), progres financiar (≥ 30 % la L10, ≥ 70 % la L18), cerere IP depusă (L6)</w:t>
+              <w:t xml:space="preserve">Achiziții (L4, L15), progres financiar (≥ 30 % la L10, ≥ 70 % la L18), cerere de marcă depusă (L6)</w:t>
             </w:r>
           </w:p>
         </w:tc>
@@ -29050,7 +29131,7 @@
               <w:rPr>
                 <w:lang w:val="ro-RO"/>
               </w:rPr>
-              <w:t xml:space="preserve">Cererile IP (design UE, marcă UE) + raportul de brevetabilitate</w:t>
+              <w:t xml:space="preserve">Cererile IP din proiect (marcă UE, design UE pentru elementele noi) + raportul de brevetabilitate</w:t>
             </w:r>
           </w:p>
         </w:tc>
@@ -29114,7 +29195,7 @@
               <w:rPr>
                 <w:lang w:val="ro-RO"/>
               </w:rPr>
-              <w:t xml:space="preserve">L5 / L6 / L18</w:t>
+              <w:t xml:space="preserve">L6 / L18</w:t>
             </w:r>
           </w:p>
         </w:tc>
@@ -29767,7 +29848,7 @@
               <w:rPr>
                 <w:lang w:val="ro-RO"/>
               </w:rPr>
-              <w:t xml:space="preserve"> Dacă motorul de randare SDF anti-aliased rulează pe ESP32-S3 cu framebuffer în PSRAM și bounce-buffers pe magistrala RGB a panoului ST7701 480×480, atunci animația ochilor menține median ≥ 30 fps (p5 ≥ 24) cu Wi-Fi și BLE active, fără artefacte de drift.</w:t>
+              <w:t xml:space="preserve"> Dacă motorul de randare SDF anti-aliased rulează pe ESP32-S3 cu framebuffer în PSRAM și bounce-buffers pe magistrala RGB a panoului ST7701 480×480, atunci animația ochilor (31 de expresii) menține median ≥ 30 fps (p5 ≥ 24) cu Wi-Fi și BLE active, fără artefacte de drift.</w:t>
             </w:r>
           </w:p>
         </w:tc>
@@ -29999,13 +30080,13 @@
                 <w:bCs/>
                 <w:lang w:val="ro-RO"/>
               </w:rPr>
-              <w:t xml:space="preserve">AI hibrid și voce.</w:t>
-            </w:r>
-            <w:r>
-              <w:rPr>
-                <w:lang w:val="ro-RO"/>
-              </w:rPr>
-              <w:t xml:space="preserve"> Dacă acțiunile utilizatorului sunt descrise printr-un singur set de scheme JSON executate în trei moduri (fără AI / Claude / ChatGPT) cu parser local RO/EN și degradare controlată, iar vocea circulă prin Opus/WebSocket către servere UE, atunci ≥ 90 % din comenzi se execută corect fără internet, latența vocală p50 ≤ 1,5 s (p90 ≤ 2,5 s) și 100 % din căderile de rețea/cheie sunt tratate fără blocare.</w:t>
+              <w:t xml:space="preserve">AI la alegerea proprietarului, offline-first.</w:t>
+            </w:r>
+            <w:r>
+              <w:rPr>
+                <w:lang w:val="ro-RO"/>
+              </w:rPr>
+              <w:t xml:space="preserve"> Dacă acțiunile utilizatorului sunt descrise printr-un singur set de scheme JSON, executate offline (parser local RO/EN și comenzi vocale offline EN, ESP-SR) sau de AI-ul conectat de proprietar (Claude, cu cheia lui sau prin conectorul din aplicația Claude; ChatGPT, cu cheia lui), cu degradare controlată și cu o memorie portabilă păstrată pe dispozitiv (SOUL Memory), atunci ≥ 90 % din comenzi se execută corect fără internet, un tur AI are latența p50 ≤ 1,5 s (p90 ≤ 2,5 s), 100 % din căderile de rețea/cheie sunt tratate fără blocare și memoria se păstrează integral la schimbarea AI-ului.</w:t>
             </w:r>
           </w:p>
         </w:tc>
@@ -30037,7 +30118,7 @@
               <w:rPr>
                 <w:lang w:val="ro-RO"/>
               </w:rPr>
-              <w:t xml:space="preserve">Poate un dispozitiv să rămână util offline și rapid online, independent de un singur furnizor de AI?</w:t>
+              <w:t xml:space="preserve">Poate un dispozitiv să rămână util offline și rapid online, independent de un singur furnizor de AI și fără să includă sau să revândă AI?</w:t>
             </w:r>
           </w:p>
         </w:tc>
@@ -30243,7 +30324,7 @@
               <w:rPr>
                 <w:lang w:val="ro-RO"/>
               </w:rPr>
-              <w:t xml:space="preserve"> Dacă managementul luminii de fundal, somnul radioului și bateria de 2500–3000 mAh sunt integrate într-o arhitectură cu baterie înlocuibilă de utilizator (conector MX1.25, Torx, fără adeziv), atunci autonomia în profil tipic este ≥ 24 h (standby ≥ 7 zile), iar utilizatori neexperți înlocuiesc bateria în ≤ 5 min cu 100 % reușită și SUS ≥ 75.</w:t>
+              <w:t xml:space="preserve"> Dacă managementul luminii de fundal, somnul radioului și CPU-ului și bateria LiPo de 1500 mAh sunt integrate într-o arhitectură cu baterie înlocuibilă de utilizator (conector MX1.25, Torx, fără adeziv), atunci autonomia în profil tipic este ≥ 24 h, iar utilizatori neexperți înlocuiesc bateria în ≤ 5 min cu 100 % reușită și SUS ≥ 75.</w:t>
             </w:r>
           </w:p>
         </w:tc>
@@ -30275,7 +30356,7 @@
               <w:rPr>
                 <w:lang w:val="ro-RO"/>
               </w:rPr>
-              <w:t xml:space="preserve">Poate un obiect premium, cu ecran IPS mare, să aibă o zi întreagă de autonomie și baterie schimbabilă de utilizator (Reg. (UE) 2023/1542 art. 11)?</w:t>
+              <w:t xml:space="preserve">Poate un obiect premium, cu ecran IPS rotund de 2,8″, să aibă o zi întreagă de autonomie și baterie schimbabilă de utilizator (Reg. (UE) 2023/1542 art. 11)?</w:t>
             </w:r>
           </w:p>
         </w:tc>
@@ -31743,7 +31824,7 @@
               <w:rPr>
                 <w:lang w:val="ro-RO"/>
               </w:rPr>
-              <w:t xml:space="preserve">Comenzi executate corect fără internet</w:t>
+              <w:t xml:space="preserve">Comenzi executate corect fără internet (scrise și vocale)</w:t>
             </w:r>
           </w:p>
         </w:tc>
@@ -31839,7 +31920,7 @@
               <w:rPr>
                 <w:lang w:val="ro-RO"/>
               </w:rPr>
-              <w:t xml:space="preserve">P5: corpus de 200 de comenzi RO/EN; comenzile reale din teren</w:t>
+              <w:t xml:space="preserve">P5: 200 de comenzi RO/EN scrise + 100 vocale EN; comenzile reale din teren</w:t>
             </w:r>
           </w:p>
         </w:tc>
@@ -31950,7 +32031,7 @@
               <w:rPr>
                 <w:lang w:val="ro-RO"/>
               </w:rPr>
-              <w:t xml:space="preserve">Latența vocală end-to-end (p50 / p90)</w:t>
+              <w:t xml:space="preserve">Latența unui tur AI end-to-end (p50 / p90)</w:t>
             </w:r>
           </w:p>
         </w:tc>
@@ -32046,7 +32127,7 @@
               <w:rPr>
                 <w:lang w:val="ro-RO"/>
               </w:rPr>
-              <w:t xml:space="preserve">P6: 100 de ture, Wi-Fi casnic, servere UE</w:t>
+              <w:t xml:space="preserve">P6: 100 de ture, Wi-Fi casnic, AI-ul proprietarului</w:t>
             </w:r>
           </w:p>
         </w:tc>
@@ -32157,7 +32238,7 @@
               <w:rPr>
                 <w:lang w:val="ro-RO"/>
               </w:rPr>
-              <w:t xml:space="preserve">Scenarii de cădere fără blocare / sesiuni fără crash</w:t>
+              <w:t xml:space="preserve">Scenarii de cădere fără blocare / sesiuni fără crash / memorie păstrată la schimbarea AI-ului</w:t>
             </w:r>
           </w:p>
         </w:tc>
@@ -32221,7 +32302,7 @@
               <w:rPr>
                 <w:lang w:val="ro-RO"/>
               </w:rPr>
-              <w:t xml:space="preserve">100 / ≥ 99</w:t>
+              <w:t xml:space="preserve">100 / ≥ 99 / 100</w:t>
             </w:r>
           </w:p>
         </w:tc>
@@ -32253,7 +32334,7 @@
               <w:rPr>
                 <w:lang w:val="ro-RO"/>
               </w:rPr>
-              <w:t xml:space="preserve">P7: 50 de scenarii; telemetrie TRL 5</w:t>
+              <w:t xml:space="preserve">P7: 50 + 10 scenarii; telemetrie TRL 5</w:t>
             </w:r>
           </w:p>
         </w:tc>
@@ -32985,7 +33066,7 @@
               <w:rPr>
                 <w:lang w:val="ro-RO"/>
               </w:rPr>
-              <w:t xml:space="preserve">Autonomie în profil tipic / standby</w:t>
+              <w:t xml:space="preserve">Autonomie în profil tipic (LiPo 1500 mAh)</w:t>
             </w:r>
           </w:p>
         </w:tc>
@@ -33017,7 +33098,7 @@
               <w:rPr>
                 <w:lang w:val="ro-RO"/>
               </w:rPr>
-              <w:t xml:space="preserve">h / zile</w:t>
+              <w:t xml:space="preserve">h</w:t>
             </w:r>
           </w:p>
         </w:tc>
@@ -33049,7 +33130,7 @@
               <w:rPr>
                 <w:lang w:val="ro-RO"/>
               </w:rPr>
-              <w:t xml:space="preserve">TRL 4: model validat ± 15 %; TRL 5: ≥ 24 h / ≥ 7 zile</w:t>
+              <w:t xml:space="preserve">TRL 4: model validat ± 15 %; TRL 5: ≥ 24 h</w:t>
             </w:r>
           </w:p>
         </w:tc>
@@ -33852,7 +33933,7 @@
               <w:rPr>
                 <w:lang w:val="ro-RO"/>
               </w:rPr>
-              <w:t xml:space="preserve">TRL 4: pragurile O1 (fps ≥ 30, touch ≥ 97 %, WPM ≥ 15, offline ≥ 90 %, p50 ≤ 1,8 s, 8/8 protocoale)</w:t>
+              <w:t xml:space="preserve">TRL 4: pragurile O1 (fps ≥ 30, touch ≥ 97 %, WPM ≥ 15, offline ≥ 90 %, tur AI p50 ≤ 1,8 s, 8/8 protocoale)</w:t>
             </w:r>
           </w:p>
         </w:tc>
@@ -34145,7 +34226,7 @@
               <w:rPr>
                 <w:lang w:val="ro-RO"/>
               </w:rPr>
-              <w:t xml:space="preserve">2 cereri EUIPO (design ≤ L5, marcă ≤ L6) + 1 raport de brevetabilitate</w:t>
+              <w:t xml:space="preserve">2 cereri EUIPO în proiect (marcă ≤ L6, design pentru elementele noi ≤ L18) + 1 raport de brevetabilitate (soluțiile nepublicate)</w:t>
             </w:r>
           </w:p>
         </w:tc>
@@ -34544,7 +34625,7 @@
         <w:rPr>
           <w:lang w:val="ro-RO"/>
         </w:rPr>
-        <w:t xml:space="preserve"> asistentul nu e legat de un singur furnizor extra-UE (BYO-AI, parser local, servere UE, server publicabil/escrow); datele rămân în UE (GDPR); produsul aplică de la proiectare Reg. (UE) 2023/1542 (baterie înlocuibilă), Dir. (UE) 2024/1799 (reparabilitate), EN 18031 (securitate) și AI Act art. 50 (transparență).</w:t>
+        <w:t xml:space="preserve"> asistentul nu e legat de un singur furnizor extra-UE (AI-ul proprietarului, mod offline complet, memoria pe dispozitiv, SOUL Cloud în UE, SOUL Bridge open source); datele rămân în UE (GDPR: export și ștergere); produsul aplică de la proiectare Reg. (UE) 2023/1542 (baterie înlocuibilă), Dir. (UE) 2024/1799 (reparabilitate), EN 18031 (securitate) și AI Act art. 50 (transparență).</w:t>
       </w:r>
     </w:p>
     <w:p>
@@ -34579,7 +34660,7 @@
         <w:rPr>
           <w:lang w:val="ro-RO"/>
         </w:rPr>
-        <w:t xml:space="preserve"> (APC bugetat, linia 21) după depunerea cererilor IP (regula „întâi protecția, apoi publicarea”: design ≤ L5, marcă ≤ L6, trimitere ≤ L20); preprint și setul de date anonimizat în Zenodo (repozitoriu OA); o comunicare la o conferință/târg internațional (linia 22); demo public.</w:t>
+        <w:t xml:space="preserve"> (APC bugetat, linia 21) după depunerea cererilor IP pentru elementele încă nepublicate (marcă ≤ L6, design pentru elementele noi ≤ L18, trimitere ≤ L20; forma MĂRGĂRITAR, publică din 24.09.2026, se depune ca design înainte de 24.09.2027, în afara proiectului); preprint și setul de date anonimizat în Zenodo (repozitoriu OA); o comunicare la o conferință/târg internațional (linia 22); demo public.</w:t>
       </w:r>
     </w:p>
     <w:p>
@@ -34743,7 +34824,7 @@
           <w:bCs/>
           <w:lang w:val="ro-RO"/>
         </w:rPr>
-        <w:t xml:space="preserve">Publicații științifice recente (≤ 5 ani; DOI verificate la 25.09.2026):</w:t>
+        <w:t xml:space="preserve">Publicații științifice recente (≤ 5 ani; DOI verificate la 25.09.2026 prin Crossref/arXiv):</w:t>
       </w:r>
     </w:p>
     <w:p>
@@ -35247,7 +35328,7 @@
         <w:rPr>
           <w:lang w:val="ro-RO"/>
         </w:rPr>
-        <w:t xml:space="preserve">D1 — depozitul git, `micul-smecher/firmware/` (README, test/test_suflet: 61 de teste Unity), commit b84f714 din 25.09.2026 </w:t>
+        <w:t xml:space="preserve">D1 — depozitul git, `micul-smecher/firmware/` (README, PERF.md, BRINGUP.md, test/: 198+ teste native), SoulOS 1.8.0, commit 95d8465 din 04.10.2026 </w:t>
       </w:r>
       <w:r>
         <w:rPr>
@@ -35278,7 +35359,7 @@
         <w:rPr>
           <w:lang w:val="ro-RO"/>
         </w:rPr>
-        <w:t xml:space="preserve">D2 — `firmware/sim` + `media/` (clipurile simulatorului, MP4/GIF).</w:t>
+        <w:t xml:space="preserve">D2 — `firmware/sim` + `firmware/PERF.md` + `media/` (clipurile simulatorului, MP4/GIF).</w:t>
       </w:r>
     </w:p>
     <w:p>
@@ -35296,7 +35377,7 @@
         <w:rPr>
           <w:lang w:val="ro-RO"/>
         </w:rPr>
-        <w:t xml:space="preserve">D3 — `micul-smecher/ai/` (README, tests/: 49 de teste pytest).</w:t>
+        <w:t xml:space="preserve">D3 — `micul-smecher/ai/` (SOUL Cloud: README, tests/: 283 de teste), `bridge/` (SOUL Bridge, MIT), `docs/07-CONNECT-AI.md`, `docs/10-SOUL-MEMORY.md`.</w:t>
       </w:r>
     </w:p>
     <w:p>
@@ -35314,7 +35395,7 @@
         <w:rPr>
           <w:lang w:val="ro-RO"/>
         </w:rPr>
-        <w:t xml:space="preserve">D4 — `os/index.html`, `os/SPEC.md`, `os/ARCHITECTURE.md`, `os/research/04` (prototipul web SoulOS).</w:t>
+        <w:t xml:space="preserve">D4 — `os/index.html`, `os/DESIGN-ALIVE.md`, `os/ARCHITECTURE.md` (SoulOS pe web).</w:t>
       </w:r>
     </w:p>
     <w:p>
@@ -35350,7 +35431,7 @@
         <w:rPr>
           <w:lang w:val="ro-RO"/>
         </w:rPr>
-        <w:t xml:space="preserve">D6 — `prototip/`, `cad/`, `renders/` (CAD CadQuery, STL/STEP, randări).</w:t>
+        <w:t xml:space="preserve">D6 — `renders/v9/`, `blueprints/final/`, `prototip/` (forma MĂRGĂRITAR: randări, planșe, STL).</w:t>
       </w:r>
     </w:p>
     <w:p>
@@ -35386,7 +35467,7 @@
         <w:rPr>
           <w:lang w:val="ro-RO"/>
         </w:rPr>
-        <w:t xml:space="preserve">D8 — „Raport de laborator TRL 3 — SOUL M (2.8C)”, X1–X8 </w:t>
+        <w:t xml:space="preserve">D8 — „Raport de laborator TRL 3 — SOUL M (2.8C)”, X1–X8, cu video pe placa reală </w:t>
       </w:r>
       <w:r>
         <w:rPr>
@@ -36336,6 +36417,23 @@
           <w:lang w:val="ro-RO"/>
         </w:rPr>
         <w:t xml:space="preserve">[ZZ/LL/AAAA]</w:t>
+      </w:r>
+    </w:p>
+    <w:p>
+      <w:pPr>
+        <w:spacing w:after="80"/>
+        <w:rPr>
+          <w:lang w:val="ro-RO"/>
+        </w:rPr>
+      </w:pPr>
+      <w:r>
+        <w:rPr>
+          <w:b/>
+          <w:bCs/>
+          <w:color w:val="C00000"/>
+          <w:lang w:val="ro-RO"/>
+        </w:rPr>
+        <w:t xml:space="preserve">DRAFT — NU SE SEMNEAZĂ ȘI NU SE DEPUNE. TRL 3 este declarat, dar se atestă doar după dovada D8 (raportul de laborator TRL 3 pe placa Waveshare 2.8C, experimentele X1–X8 filmate), care e în curs. Poarta de lansare din _build/data.py (D8_DONE) blochează versiunea pentru semnare până atunci.</w:t>
       </w:r>
     </w:p>
     <w:p>

</xml_diff>

<commit_message>
PoC 1.1: buget sincronizat cu ofertele verificate (L5, L7, L14, L19), drafturi reconstruite
Co-Authored-By: Claude Opus 5.5 <noreply@anthropic.com>
Claude-Session: https://claude.ai/code/session_01Ck8guzeJBknbgPsaU2FiFA
</commit_message>
<xml_diff>
--- a/micul-smecher/investors/poc-1.1/dosar/draft/Anexa_16_Raport_Stiintific_SOUL_DRAFT.docx
+++ b/micul-smecher/investors/poc-1.1/dosar/draft/Anexa_16_Raport_Stiintific_SOUL_DRAFT.docx
@@ -34647,20 +34647,20 @@
         <w:rPr>
           <w:lang w:val="ro-RO"/>
         </w:rPr>
-        <w:t xml:space="preserve"> articol trimis la o revistă open-access peer-review indexată </w:t>
+        <w:t xml:space="preserve"> articol trimis la o revistă open-access peer-review indexată (Frontiers in Robotics and AI (APC CHF 2.195 ≈ 2.349 € fără TVA, bugetat în linia 21; alternative verificate: IEEE Access, JMIR Human Factors)) </w:t>
       </w:r>
       <w:r>
         <w:rPr>
           <w:highlight w:val="yellow"/>
           <w:lang w:val="ro-RO"/>
         </w:rPr>
-        <w:t xml:space="preserve">[Cl: revista țintă — ex. MDPI Electronics / Sensors sau IEEE Access; captura paginii de APC]</w:t>
+        <w:t xml:space="preserve">[Cl: captura paginii de APC]</w:t>
       </w:r>
       <w:r>
         <w:rPr>
           <w:lang w:val="ro-RO"/>
         </w:rPr>
-        <w:t xml:space="preserve"> (APC bugetat, linia 21) după depunerea cererilor IP pentru elementele încă nepublicate (marcă ≤ L6, design pentru elementele noi ≤ L18, trimitere ≤ L20; forma MĂRGĂRITAR, publică din 24.09.2026, se depune ca design înainte de 24.09.2027, în afara proiectului); preprint și setul de date anonimizat în Zenodo (repozitoriu OA); o comunicare la o conferință/târg internațional (linia 22); demo public.</w:t>
+        <w:t xml:space="preserve"> după depunerea cererilor IP pentru elementele încă nepublicate (marcă ≤ L6, design pentru elementele noi ≤ L18, trimitere ≤ L20; forma MĂRGĂRITAR, publică din 24.09.2026, se depune ca design înainte de 24.09.2027, în afara proiectului); preprint și setul de date anonimizat în Zenodo (repozitoriu OA); o comunicare la o conferință/târg internațional (linia 22); demo public.</w:t>
       </w:r>
     </w:p>
     <w:p>

</xml_diff>

<commit_message>
SOUL S: consistency fixes
Co-Authored-By: Claude Opus 5.5 <noreply@anthropic.com>

Claude-Session: https://claude.ai/code/session_01Ck8guzeJBknbgPsaU2FiFA
</commit_message>
<xml_diff>
--- a/micul-smecher/investors/poc-1.1/dosar/draft/Anexa_16_Raport_Stiintific_SOUL_DRAFT.docx
+++ b/micul-smecher/investors/poc-1.1/dosar/draft/Anexa_16_Raport_Stiintific_SOUL_DRAFT.docx
@@ -1892,7 +1892,7 @@
         <w:rPr>
           <w:lang w:val="ro-RO"/>
         </w:rPr>
-        <w:t xml:space="preserve"> aceste constrângeri pe un hardware de cost redus (MCU ESP32-S3, fără GPU dedicat), într-o carcasă metalică premium: randarea procedurală fluidă pe un panou RGB fără memorie proprie concurează cu radioul pentru lățimea de bandă PSRAM (H1); tastatura pe un disc de ~70 mm depinde de decodare (H2); independența de cloud și de un singur furnizor de AI cere o arhitectură local-first verificabilă, în care AI-ul e al proprietarului și memoria rămâne pe dispozitiv (H3); aluminiul atenuează semnalul 2,4 GHz (H4); ecranul IPS de 2,8″ și bateria înlocuibilă de 1500 mAh concurează pentru volum și energie (H5).</w:t>
+        <w:t xml:space="preserve"> aceste constrângeri pe un hardware de cost redus (MCU ESP32-S3, fără GPU dedicat), într-o carcasă metalică premium: randarea procedurală fluidă pe un panou RGB fără memorie proprie concurează cu radioul pentru lățimea de bandă PSRAM (H1); tastatura pe un disc de ~70 mm depinde de decodare (H2); independența de cloud și de un singur furnizor de AI cere o arhitectură local-first verificabilă, în care AI-ul e al proprietarului și memoria rămâne pe dispozitiv (H3); aluminiul atenuează semnalul 2,4 GHz (H4); în corpul mic al lui SOUL S (~63 × 71 × 23 mm), ecranul AMOLED de 1,75″ și bateria înlocuibilă de 750 mAh concurează pentru volum și energie (H5).</w:t>
       </w:r>
     </w:p>
     <w:p>
@@ -1928,7 +1928,7 @@
         <w:rPr>
           <w:lang w:val="ro-RO"/>
         </w:rPr>
-        <w:t xml:space="preserve"> un dispozitiv de ~90 × 101 × 31,5 mm cu afișaj rotund de 2,8″ integrează (i) un motor de randare SDF optimizat pentru un microcontroler ESP32-S3, (ii) o tastatură QWERTY circulară cu decodare probabilistică, (iii) o arhitectură local-first în care AI-ul e ales și conectat de proprietar, cu degradare controlată și memorie portabilă pe dispozitiv, și (iv) o carcasă din aluminiu cu fereastră radio polimerică și baterie înlocuibilă, </w:t>
+        <w:t xml:space="preserve"> un dispozitiv de ~63 × 70,8 × 23 mm (SOUL S) cu afișaj rotund AMOLED de 1,75″ (466×466) integrează (i) un motor de randare SDF optimizat pentru un microcontroler ESP32-S3, (ii) o tastatură QWERTY circulară cu decodare probabilistică, (iii) o arhitectură local-first în care AI-ul e ales și conectat de proprietar, cu degradare controlată și memorie portabilă pe dispozitiv, și (iv) o carcasă din aluminiu cu fereastră radio polimerică și baterie înlocuibilă de 750 mAh, </w:t>
       </w:r>
       <w:r>
         <w:rPr>
@@ -4811,7 +4811,7 @@
         <w:rPr>
           <w:lang w:val="ro-RO"/>
         </w:rPr>
-        <w:t xml:space="preserve"> sistem ciber-fizic integrat — ESP32-S3, afișaj rotund IPS 480×480, touch capacitiv, giroscop/accelerometru, RTC, microfon și difuzor I²S opționale, baterie LiPo 1500 mAh înlocuibilă și antenă BLE/Wi-Fi integrată într-o carcasă CNC din aluminiu cu fereastră radio polimerică. Obiective O2, O3; activități A4, A5; rezultate: PCB propriu, arhitectura electromecanică, măsurătorile RF/energie/EMC (R2, R3).</w:t>
+        <w:t xml:space="preserve"> sistem ciber-fizic integrat — ESP32-S3, afișaj rotund AMOLED 466×466, touch capacitiv, giroscop/accelerometru, RTC, 2 microfoane și difuzor, baterie LiPo 750 mAh înlocuibilă și antenă BLE/Wi-Fi integrată într-o carcasă CNC din aluminiu cu fereastră radio polimerică. Obiective O2, O3; activități A4, A5; rezultate: PCB propriu, arhitectura electromecanică, măsurătorile RF/energie/EMC (R2, R3).</w:t>
       </w:r>
     </w:p>
     <w:p>
@@ -5172,7 +5172,7 @@
               <w:rPr>
                 <w:lang w:val="ro-RO"/>
               </w:rPr>
-              <w:t xml:space="preserve">Realizarea și validarea în laborator (TRL 4) a modelului integrat SOUL M (afișaj rotund 2,8″ + touch + IMU + audio opțional + baterie + AI la alegerea proprietarului)</w:t>
+              <w:t xml:space="preserve">Realizarea și validarea în laborator (TRL 4) a modelului integrat SOUL S (afișaj rotund AMOLED 1,75″ 466×466 + touch + IMU + audio cu 2 microfoane și difuzor + baterie LiPo 750 mAh + AI la alegerea proprietarului)</w:t>
             </w:r>
           </w:p>
         </w:tc>
@@ -5824,7 +5824,7 @@
         <w:rPr>
           <w:lang w:val="ro-RO"/>
         </w:rPr>
-        <w:t xml:space="preserve"> — Model de laborator SOUL M validat la TRL 4 + Raport de validare TRL 4 (L14) · </w:t>
+        <w:t xml:space="preserve"> — Model de laborator SOUL S validat la TRL 4 + Raport de validare TRL 4 (L14) · </w:t>
       </w:r>
       <w:r>
         <w:rPr>
@@ -5838,7 +5838,7 @@
         <w:rPr>
           <w:lang w:val="ro-RO"/>
         </w:rPr>
-        <w:t xml:space="preserve"> — 15 prototipuri SOUL M pre-serie validate la TRL 5 în mediu relevant + Raport TRL 5 + raport de pre-testare EMC/RF (L22) · </w:t>
+        <w:t xml:space="preserve"> — 15 prototipuri SOUL S pre-serie validate la TRL 5 în mediu relevant + Raport TRL 5 + raport de pre-testare EMC/RF (L22) · </w:t>
       </w:r>
       <w:r>
         <w:rPr>
@@ -5988,13 +5988,13 @@
           <w:bCs/>
           <w:lang w:val="ro-RO"/>
         </w:rPr>
-        <w:t xml:space="preserve">Hardware:</w:t>
+        <w:t xml:space="preserve">Hardware (produsul, SOUL S):</w:t>
       </w:r>
       <w:r>
         <w:rPr>
           <w:lang w:val="ro-RO"/>
         </w:rPr>
-        <w:t xml:space="preserve"> ESP32-S3R8 (8 MB PSRAM, 16 MB flash; prototipul folosește placa Waveshare ESP32-S3-Touch-LCD-2.8C); panou IPS rotund 2,8″ 480×480 cu touch, controler ST7701, interfață RGB565 paralelă, framebuffer în PSRAM, bounce-buffers; touch GT911; giroscop/accelerometru QMI8658; RTC PCF85063A; buzzer; microfon MEMS I²S + amplificator și difuzor I²S (opționale); celulă LiPo 1500 mAh pe conector MX1.25 (înlocuibilă).</w:t>
+        <w:t xml:space="preserve"> ESP32-S3 (modelul de laborator: placa Waveshare ESP32-S3-Touch-AMOLED-1.75, ESP32-S3R8, 8 MB PSRAM, 16 MB flash; produsul: PCB propriu cu ESP32-S3-WROOM-1-N16R8 [estimare EVT]); panou AMOLED rotund 1,75″ 466×466 cu touch, controler CO5300, interfață QSPI, memorie de cadru în panou, framebuffer în PSRAM, push doar pe regiunile modificate; touch CST9217; giroscop/accelerometru QMI8658; RTC PCF85063; PMU AXP2101; 2 microfoane MEMS cu codecurile ES7210 + ES8311 și difuzor; celulă LiPo 750 mAh (603040) pe conector MX1.25 (înlocuibilă); autonomie ~27 h [estimare].</w:t>
       </w:r>
     </w:p>
     <w:p>
@@ -6014,13 +6014,39 @@
           <w:bCs/>
           <w:lang w:val="ro-RO"/>
         </w:rPr>
+        <w:t xml:space="preserve">Prototipul de banc pentru TRL 3 (SOUL M, nu produsul):</w:t>
+      </w:r>
+      <w:r>
+        <w:rPr>
+          <w:lang w:val="ro-RO"/>
+        </w:rPr>
+        <w:t xml:space="preserve"> placa Waveshare ESP32-S3-Touch-LCD-2.8C (ESP32-S3R8; panou IPS rotund 2,8″ 480×480, ST7701, RGB565 paralel, bounce-buffers; touch GT911; QMI8658; RTC; buzzer), LiPo 1500 mAh, corp ~90 × 101 × 31,5 mm. Pe el se rulează X1–X8 (D8); firmware-ul e același (`env:lcd28` vs `env:amoled175`).</w:t>
+      </w:r>
+    </w:p>
+    <w:p>
+      <w:pPr>
+        <w:numPr>
+          <w:ilvl w:val="0"/>
+          <w:numId w:val="2"/>
+        </w:numPr>
+        <w:spacing w:after="80"/>
+        <w:rPr>
+          <w:lang w:val="ro-RO"/>
+        </w:rPr>
+      </w:pPr>
+      <w:r>
+        <w:rPr>
+          <w:b/>
+          <w:bCs/>
+          <w:lang w:val="ro-RO"/>
+        </w:rPr>
         <w:t xml:space="preserve">Mecanică:</w:t>
       </w:r>
       <w:r>
         <w:rPr>
           <w:lang w:val="ro-RO"/>
         </w:rPr>
-        <w:t xml:space="preserve"> corp ~90 × 101 × 31,5 mm, forma MĂRGĂRITAR, CNC din Al 6061 sablat și anodizat (5 culori); talpă polimerică detașabilă = fereastră radio pentru antena 2,4 GHz; închidere Torx, fără adeziv pe celulă; capsula de încărcare „OU” cu pini pogo.</w:t>
+        <w:t xml:space="preserve"> corp ~63 × 70,8 × 23 mm (SOUL S), forma MĂRGĂRITAR, sticlă neagră plată Ø52, CNC din Al 6061 sablat și anodizat (5 culori); talpă polimerică detașabilă = fereastră radio pentru antena 2,4 GHz; închidere Torx, fără adeziv pe celulă; capsula de încărcare „OU” cu pini pogo.</w:t>
       </w:r>
     </w:p>
     <w:p>
@@ -6357,7 +6383,7 @@
               <w:rPr>
                 <w:lang w:val="ro-RO"/>
               </w:rPr>
-              <w:t xml:space="preserve">Randare SDF anti-aliased a „ochilor” parametrici pe MCU, pe un panou RGB 480×480 fără memorie proprie (framebuffer în PSRAM)</w:t>
+              <w:t xml:space="preserve">Randare SDF anti-aliased a „ochilor” parametrici pe MCU, cu framebuffer în PSRAM și push pe regiuni modificate prin QSPI către un AMOLED 466×466 (validată întâi pe panoul RGB 480×480 fără memorie proprie al prototipului M)</w:t>
             </w:r>
           </w:p>
         </w:tc>
@@ -7711,7 +7737,7 @@
               <w:rPr>
                 <w:lang w:val="ro-RO"/>
               </w:rPr>
-              <w:t xml:space="preserve">PARCURS (sept.–oct. 2026). Conceptul SOUL a fost formulat și documentat: specificația SoulOS (os/SPEC.md, os/ARCHITECTURE.md, os/DESIGN-ALIVE.md), arhitectura conectării AI-ului proprietarului (docs/07) și a memoriei (docs/10), studiile de piață, conformitate și competiție (research 01–11, benchmark de 24 de competitori), modelul geometric al tastaturii (pas = 0,0944·D; taste de 6,7 mm pe Ø70) și alegerea panoului 2,8″ IPS 480×480 (research 12), conceptul de carcasă din aluminiu cu fereastră radio (research 10). Aplicații identificate: aprobări AI, notițe/alarme offline, accesibilitate.</w:t>
+              <w:t xml:space="preserve">PARCURS (sept.–oct. 2026). Conceptul SOUL a fost formulat și documentat: specificația SoulOS (os/SPEC.md, os/ARCHITECTURE.md, os/DESIGN-ALIVE.md), arhitectura conectării AI-ului proprietarului (docs/07) și a memoriei (docs/10), studiile de piață, conformitate și competiție (research 01–11, benchmark de 24 de competitori), modelul geometric al tastaturii (pas = 0,0944·D; taste de 6,7 mm pe Ø70) și alegerea panoului: 2,8″ IPS 480×480 pentru prototipul de banc M (research 12), apoi AMOLED 1,75″ 466×466 pentru produsul S (docs/12-SIZE-S.md, 20.10.2026: stiva internă, bateria de 750 mAh, autonomia ~27 h [estimare]), conceptul de carcasă din aluminiu cu fereastră radio (research 10). Aplicații identificate: aprobări AI, notițe/alarme offline, accesibilitate.</w:t>
             </w:r>
           </w:p>
         </w:tc>
@@ -8051,7 +8077,7 @@
               <w:rPr>
                 <w:lang w:val="ro-RO"/>
               </w:rPr>
-              <w:t xml:space="preserve">PLANIFICAT (L14). A1–A3: modelul de laborator SOUL M integrat (afișaj + touch + IMU + audio + baterie + AI-ul proprietarului, carcasă SLA) validat prin protocoalele P1–P8 la pragurile O1: fps median ≥ 30 · precizie touch ≥ 97 % · WPM ≥ 15 (N = 6) · succes offline ≥ 90 % · latența unui tur AI p50 ≤ 1,8 s · 8/8 protocoale rulate. Livrabil: R1 Raport TRL 4 (IE2) + decizia go/no-go.</w:t>
+              <w:t xml:space="preserve">PLANIFICAT (L14). A1–A3: modelul de laborator SOUL S integrat (afișaj + touch + IMU + audio + baterie + AI-ul proprietarului, carcasă SLA) validat prin protocoalele P1–P8 la pragurile O1: fps median ≥ 30 · precizie touch ≥ 97 % · WPM ≥ 15 (N = 6) · succes offline ≥ 90 % · latența unui tur AI p50 ≤ 1,8 s · 8/8 protocoale rulate. Livrabil: R1 Raport TRL 4 (IE2) + decizia go/no-go.</w:t>
             </w:r>
           </w:p>
         </w:tc>
@@ -8560,7 +8586,7 @@
               <w:rPr>
                 <w:lang w:val="ro-RO"/>
               </w:rPr>
-              <w:t xml:space="preserve">Firmware SoulOS 1.8.0 (lansat 04.10.2026, compilat fără avertismente): motorul ochilor (randare SDF, 120 de designuri, 31 de expresii, fiecare unitate primește o pereche din ID-ul cipului), IMU/giroscop, tastatura circulară, alarme, notițe, hărți/vreme/aplicații, SOUL Memory, comenzi vocale offline EN (ESP-SR), legătura Claude Hardware Buddy (BLE), protocolul SOUL Cloud; 198+ teste native trec pe PC (`pio test -e native`); build-uri `lcd28` (placa 2.8C, SOUL M), `lcd28_voice` și `sim`. Reproiectarea „SoulOS Alive” (aprobată 12.10.2026) e în lucru (1.9.0)</w:t>
+              <w:t xml:space="preserve">Firmware SoulOS 1.8.0 (lansat 04.10.2026, compilat fără avertismente): motorul ochilor (randare SDF, 120 de designuri, 31 de expresii, fiecare unitate primește o pereche din ID-ul cipului), IMU/giroscop, tastatura circulară, alarme, notițe, hărți/vreme/aplicații, SOUL Memory, comenzi vocale offline EN (ESP-SR), legătura Claude Hardware Buddy (BLE), protocolul SOUL Cloud; 198+ teste native trec pe PC (`pio test -e native`); build-uri `lcd28` (placa 2.8C, prototipul SOUL M), `lcd28_voice`, `amoled175` (placa AMOLED-1.75, SOUL S) și `sim`. Reproiectarea „SoulOS Alive” (aprobată 12.10.2026) e în lucru (1.9.0)</w:t>
             </w:r>
           </w:p>
         </w:tc>
@@ -9267,7 +9293,7 @@
               <w:rPr>
                 <w:lang w:val="ro-RO"/>
               </w:rPr>
-              <w:t xml:space="preserve">Geometria tastaturii pe diametre (pas = 0,0944·D → 6,7 mm pe Ø70) și analiza panoului: justificarea analitică a alegerii 2,8″ IPS 480×480</w:t>
+              <w:t xml:space="preserve">Geometria tastaturii pe diametre (pas = 0,0944·D → 6,7 mm pe Ø70 la M; 4,1 mm la S, de aceea tastatura S cu taste de 5,1 mm) și analiza panoului și a mărimii: justificarea alegerii AMOLED 1,75″ 466×466 pentru produsul S (stiva internă, bateria de 750 mAh, autonomia [estimare], costul), cu IPS 2,8″ 480×480 păstrat pe prototipul M</w:t>
             </w:r>
           </w:p>
         </w:tc>
@@ -9299,7 +9325,7 @@
               <w:rPr>
                 <w:lang w:val="ro-RO"/>
               </w:rPr>
-              <w:t xml:space="preserve">2026-09</w:t>
+              <w:t xml:space="preserve">2026-09 / 2026-10</w:t>
             </w:r>
           </w:p>
         </w:tc>
@@ -9331,7 +9357,7 @@
               <w:rPr>
                 <w:lang w:val="ro-RO"/>
               </w:rPr>
-              <w:t xml:space="preserve">`research/12` §1–2</w:t>
+              <w:t xml:space="preserve">`research/12` §1–2, `docs/12-SIZE-S.md`, `firmware/SOUL-S.md`</w:t>
             </w:r>
           </w:p>
         </w:tc>
@@ -9442,7 +9468,7 @@
               <w:rPr>
                 <w:lang w:val="ro-RO"/>
               </w:rPr>
-              <w:t xml:space="preserve">Forma finală MĂRGĂRITAR, mărimea M (~90 × 101 × 31,5 mm, aluminiu anodizat, 5 culori): randări v9, planșe tehnice, STL-urile prototipului P0 printabil</w:t>
+              <w:t xml:space="preserve">Forma finală MĂRGĂRITAR, mărimea S (~63 × 70,8 × 23 mm, sticlă plată Ø52, aluminiu anodizat, 5 culori; decizia din 20.10.2026): randări v10, planșe tehnice S, STL/STEP-urile prototipului S-P0 printabil; mărimea M (~90 × 101 × 31,5 mm, randări v9) rămâne prototipul de test</w:t>
             </w:r>
           </w:p>
         </w:tc>
@@ -9474,7 +9500,7 @@
               <w:rPr>
                 <w:lang w:val="ro-RO"/>
               </w:rPr>
-              <w:t xml:space="preserve">2026-09</w:t>
+              <w:t xml:space="preserve">2026-09 / 2026-10</w:t>
             </w:r>
           </w:p>
         </w:tc>
@@ -9506,7 +9532,7 @@
               <w:rPr>
                 <w:lang w:val="ro-RO"/>
               </w:rPr>
-              <w:t xml:space="preserve">`renders/v9/`, `blueprints/final/`, `prototip/`</w:t>
+              <w:t xml:space="preserve">`renders/v10/`, `renders/v9/`, `blueprints/final/soul_s_*`, `prototip/stl/s/`, `prototip/step/s/`</w:t>
             </w:r>
           </w:p>
         </w:tc>
@@ -9792,7 +9818,7 @@
               <w:rPr>
                 <w:lang w:val="ro-RO"/>
               </w:rPr>
-              <w:t xml:space="preserve">Experimentele X1–X8 pe placa Waveshare ESP32-S3-Touch-LCD-2.8C (ESP32-S3R8, 8 MB PSRAM, 16 MB flash; comandată din fonduri proprii, în afara bugetului; încă netestată): bring-up, fps, precizie touch, tastare pilot, comenzi offline, latență AI, RSSI prin aluminiu, consum</w:t>
+              <w:t xml:space="preserve">Experimentele X1–X8 pe prototipul de banc SOUL M (nu produsul; produsul e mărimea S), placa Waveshare ESP32-S3-Touch-LCD-2.8C (ESP32-S3R8, 8 MB PSRAM, 16 MB flash; comandată din fonduri proprii, în afara bugetului; încă netestată): bring-up, fps, precizie touch, tastare pilot, comenzi offline, latență AI, RSSI prin aluminiu, consum</w:t>
             </w:r>
           </w:p>
         </w:tc>
@@ -9889,7 +9915,7 @@
         <w:rPr>
           <w:lang w:val="ro-RO"/>
         </w:rPr>
-        <w:t xml:space="preserve"> placa Waveshare ESP32-S3-Touch-LCD-2.8C (comandată), bateria LiPo 1500 mAh, un microfon I²S și un amplificator mic se cumpără din fonduri proprii și </w:t>
+        <w:t xml:space="preserve"> prototipul de banc SOUL M: placa Waveshare ESP32-S3-Touch-LCD-2.8C (comandată), bateria LiPo 1500 mAh, un microfon I²S și un amplificator mic se cumpără din fonduri proprii și </w:t>
       </w:r>
       <w:r>
         <w:rPr>
@@ -11385,7 +11411,7 @@
               <w:rPr>
                 <w:lang w:val="ro-RO"/>
               </w:rPr>
-              <w:t xml:space="preserve">Consumul plăcii cu LiPo 1500 mAh (ecran aprins/stins)</w:t>
+              <w:t xml:space="preserve">Consumul plăcii M (prototipul 2.8C) cu LiPo 1500 mAh (ecran aprins/stins)</w:t>
             </w:r>
           </w:p>
         </w:tc>
@@ -11775,13 +11801,13 @@
           <w:bCs/>
           <w:lang w:val="ro-RO"/>
         </w:rPr>
-        <w:t xml:space="preserve">Etapa 2 — de la componente la modelul de laborator (A2, L2–L8).</w:t>
+        <w:t xml:space="preserve">Etapa 2 — de la componente la modelul de laborator S (A2, L2–L8).</w:t>
       </w:r>
       <w:r>
         <w:rPr>
           <w:lang w:val="ro-RO"/>
         </w:rPr>
-        <w:t xml:space="preserve"> SoulOS pe panoul RGB/ST7701 cu bounce-buffers și măsurarea fps (P1) la fiecare modificare; calibrarea touch GT911 (P2) și a giroscopului; subsistemul audio I²S (microfon + amplificator) și comenzile vocale offline; alimentarea (baterie LiPo 1500 mAh, încărcare în capsula OU) și modelul de consum (P9); carcasa SLA la scara M; SOUL Cloud găzduit în UE (împerechere, conectorul Claude, cheia proprie) și SOUL Memory. IE1 (L6): modelul rulează integrat, cu primele măsurători P1, P2, P5.</w:t>
+        <w:t xml:space="preserve"> SoulOS pe AMOLED-ul 1,75″ (CO5300, push QSPI pe regiuni modificate) și măsurarea fps (P1) la fiecare modificare; calibrarea touch CST9217 (P2) și a giroscopului; subsistemul audio ES8311/ES7210 (2 microfoane + difuzor) și comenzile vocale offline; alimentarea (baterie LiPo 750 mAh, PMU AXP2101, încărcare în capsula OU), somnul ușor între cadre și modelul de consum (P9); carcasa SLA la scara S; SOUL Cloud găzduit în UE (împerechere, conectorul Claude, cheia proprie) și SOUL Memory. IE1 (L6): modelul rulează integrat, cu primele măsurători P1, P2, P5.</w:t>
       </w:r>
     </w:p>
     <w:p>
@@ -12471,7 +12497,7 @@
               <w:rPr>
                 <w:lang w:val="ro-RO"/>
               </w:rPr>
-              <w:t xml:space="preserve">grilă de ținte de 6,7 mm pe tot discul (inclusiv bordura), 200 de atingeri/persoană; baseline: X3</w:t>
+              <w:t xml:space="preserve">grilă de ținte de 5,1 mm (tasta S) pe tot discul, inclusiv bordura, pe SOUL S; 200 de atingeri/persoană (baseline TRL 3: ținte de 6,7 mm pe prototipul M, X3); baseline: X3</w:t>
             </w:r>
           </w:p>
         </w:tc>
@@ -13766,7 +13792,7 @@
               <w:rPr>
                 <w:lang w:val="ro-RO"/>
               </w:rPr>
-              <w:t xml:space="preserve">analizor de consum; profil tipic definit (ecran activ ~1 h/zi, ecran stins/somn restul zilei, 50 de întrebări AI, BLE conectat); baterie LiPo 1500 mAh; baseline: X8</w:t>
+              <w:t xml:space="preserve">analizor de consum; profil tipic definit (ecran activ ~1 h/zi, ecran stins/somn restul zilei, 50 de întrebări AI, BLE conectat); baterie LiPo 750 mAh (603040) pe S, estimare ~27 h [estimare]; baseline TRL 3: consumul prototipului M (2.8C, 1500 mAh) din X8; baseline: X8</w:t>
             </w:r>
           </w:p>
         </w:tc>
@@ -14799,7 +14825,7 @@
               <w:rPr>
                 <w:lang w:val="ro-RO"/>
               </w:rPr>
-              <w:t xml:space="preserve">Placa de dezvoltare Waveshare ESP32-S3-Touch-LCD-2.8C + simulatorul pe PC</w:t>
+              <w:t xml:space="preserve">Placa de dezvoltare Waveshare ESP32-S3-Touch-LCD-2.8C (prototipul de banc SOUL M, pentru TRL 3) + simulatorul pe PC</w:t>
             </w:r>
           </w:p>
         </w:tc>
@@ -17494,7 +17520,7 @@
               <w:rPr>
                 <w:lang w:val="ro-RO"/>
               </w:rPr>
-              <w:t xml:space="preserve">Modelul de laborator M integrat: SoulOS pe ESP32-S3 (panou RGB ST7701 480×480, touch GT911, IMU QMI8658, RTC), audio I²S opțional (microfon MEMS + amplificator + difuzor), baterie LiPo 1500 mAh, carcasă SLA la scara M, comenzi vocale offline EN (ESP-SR), conectarea AI-ului proprietarului (cheie proprie, conectorul Claude prin SOUL Cloud în UE, SOUL Bridge), memoria SOUL Memory pe dispozitiv</w:t>
+              <w:t xml:space="preserve">Modelul de laborator S integrat: SoulOS pe ESP32-S3 (placa Waveshare ESP32-S3-Touch-AMOLED-1.75: AMOLED rotund 1,75″ 466×466 CO5300 pe QSPI, touch CST9217, IMU QMI8658, RTC PCF85063, PMU AXP2101), audio pe placă (2 microfoane MEMS, codecuri ES7210 + ES8311, difuzor), baterie LiPo 750 mAh (603040), carcasă SLA la scara S (~63 × 70,8 × 23 mm), comenzi vocale offline EN (ESP-SR), conectarea AI-ului proprietarului (cheie proprie, conectorul Claude prin SOUL Cloud în UE, SOUL Bridge), memoria SOUL Memory pe dispozitiv</w:t>
             </w:r>
           </w:p>
         </w:tc>
@@ -17890,7 +17916,7 @@
               <w:rPr>
                 <w:lang w:val="ro-RO"/>
               </w:rPr>
-              <w:t xml:space="preserve">Prototipul pre-serie: PCB propriu (ESP32-S3 cu 8 MB PSRAM, ST7701, GT911, QMI8658, RTC, microfon + amplificator I²S, încărcare, pini pentru capsula OU), antenă prin fereastră polimerică, carcasă CNC Al 6061 anodizată, forma MĂRGĂRITAR, rev A (3 seturi) și rev B (5 + 15 seturi), baterie înlocuibilă, capsula OU; securitatea EN 18031 (secure boot, OTA semnat)</w:t>
+              <w:t xml:space="preserve">Prototipul pre-serie SOUL S: PCB propriu rotund ~46 mm (ESP32-S3-WROOM-1-N16R8, panou AMOLED 1,75″ 466×466 gol, CO5300/QSPI, touch, QMI8658, RTC, PMU clasa AXP2101, codecuri ES8311 + ES7210, 2 microfoane MEMS, difuzor, încărcare, pini pentru capsula OU) [estimare: arhitectura EVT din docs/12 §1.2], antenă prin fereastră polimerică, carcasă CNC Al 6061 anodizată, forma MĂRGĂRITAR, rev A (3 seturi) și rev B (5 + 15 seturi), baterie înlocuibilă, capsula OU; securitatea EN 18031 (secure boot, OTA semnat)</w:t>
             </w:r>
           </w:p>
         </w:tc>
@@ -20625,7 +20651,7 @@
                 <w:szCs w:val="14"/>
                 <w:lang w:val="ro-RO"/>
               </w:rPr>
-              <w:t xml:space="preserve">A2 Model de laborator M integrat</w:t>
+              <w:t xml:space="preserve">A2 Model de laborator S integrat</w:t>
             </w:r>
           </w:p>
         </w:tc>
@@ -27689,7 +27715,7 @@
               <w:rPr>
                 <w:lang w:val="ro-RO"/>
               </w:rPr>
-              <w:t xml:space="preserve">Specificația sistemului SOUL M</w:t>
+              <w:t xml:space="preserve">Specificația sistemului SOUL S</w:t>
             </w:r>
           </w:p>
         </w:tc>
@@ -29848,7 +29874,7 @@
               <w:rPr>
                 <w:lang w:val="ro-RO"/>
               </w:rPr>
-              <w:t xml:space="preserve"> Dacă motorul de randare SDF anti-aliased rulează pe ESP32-S3 cu framebuffer în PSRAM și bounce-buffers pe magistrala RGB a panoului ST7701 480×480, atunci animația ochilor (31 de expresii) menține median ≥ 30 fps (p5 ≥ 24) cu Wi-Fi și BLE active, fără artefacte de drift.</w:t>
+              <w:t xml:space="preserve"> Dacă motorul de randare SDF anti-aliased rulează pe ESP32-S3 cu framebuffer în PSRAM și trimite doar regiunile modificate pe QSPI către AMOLED-ul 1,75″ 466×466 (CO5300, cu memorie de cadru proprie), atunci animația ochilor (31 de expresii) menține median ≥ 30 fps (p5 ≥ 24) cu Wi-Fi și BLE active, fără artefacte de drift. Baseline-ul TRL 3 se măsoară pe prototipul M (panou RGB ST7701 480×480, bounce-buffers; X2), iar estimarea pe S e în firmware/PERF.md [estimare].</w:t>
             </w:r>
           </w:p>
         </w:tc>
@@ -29967,7 +29993,7 @@
               <w:rPr>
                 <w:lang w:val="ro-RO"/>
               </w:rPr>
-              <w:t xml:space="preserve"> Dacă tastatura QWERTY circulară (pas ≈ 0,0944·D → 6,7 mm pe Ø70, taste de margine „stăpâne” pe bordură) este combinată cu decodare probabilistică și diacritice RO automate, atunci utilizatorii ating ≥ 20 WPM cu UER ≤ 3 % și ≥ 97 % precizie touch.</w:t>
+              <w:t xml:space="preserve"> Dacă tastatura circulară (pe S: 5 rânduri de taste de 5,1 mm, alfabetică, fiecare rând cât încape în cerc — decizia din os/DESIGN-ALIVE.md; reperul de pe prototipul M: QWERTY circular, pas ≈ 0,0944·D → 6,7 mm pe Ø70, taste de margine „stăpâne” pe bordură) este combinată cu decodare probabilistică și diacritice RO automate, atunci utilizatorii ating ≥ 20 WPM cu UER ≤ 3 % și ≥ 97 % precizie touch.</w:t>
             </w:r>
           </w:p>
         </w:tc>
@@ -29999,7 +30025,7 @@
               <w:rPr>
                 <w:lang w:val="ro-RO"/>
               </w:rPr>
-              <w:t xml:space="preserve">Este introducerea de text direct pe un ecran rotund de 2,8″ suficient de rapidă și precisă pentru notițe și comenzi reale, în română și engleză?</w:t>
+              <w:t xml:space="preserve">Este introducerea de text direct pe un ecran rotund de 1,75″ suficient de rapidă și precisă pentru notițe și comenzi reale, în română și engleză?</w:t>
             </w:r>
           </w:p>
         </w:tc>
@@ -30324,7 +30350,7 @@
               <w:rPr>
                 <w:lang w:val="ro-RO"/>
               </w:rPr>
-              <w:t xml:space="preserve"> Dacă managementul luminii de fundal, somnul radioului și CPU-ului și bateria LiPo de 1500 mAh sunt integrate într-o arhitectură cu baterie înlocuibilă de utilizator (conector MX1.25, Torx, fără adeziv), atunci autonomia în profil tipic este ≥ 24 h, iar utilizatori neexperți înlocuiesc bateria în ≤ 5 min cu 100 % reușită și SUS ≥ 75.</w:t>
+              <w:t xml:space="preserve"> Dacă afișajul AMOLED (negru adevărat, fără lumină de fundal; ochii stau pe negru, iar memoria de cadru a panoului permite somnul ușor al CPU-ului între cadre), somnul radioului și CPU-ului și bateria LiPo de 750 mAh (603040) sunt integrate într-o arhitectură cu baterie înlocuibilă de utilizator (conector MX1.25, Torx, fără adeziv), atunci autonomia în profil tipic este ≥ 24 h (estimarea de pornire: ~27 h [estimare], interval 21–34 h; docs/12 §2.5), iar utilizatori neexperți înlocuiesc bateria în ≤ 5 min cu 100 % reușită și SUS ≥ 75.</w:t>
             </w:r>
           </w:p>
         </w:tc>
@@ -30356,7 +30382,7 @@
               <w:rPr>
                 <w:lang w:val="ro-RO"/>
               </w:rPr>
-              <w:t xml:space="preserve">Poate un obiect premium, cu ecran IPS rotund de 2,8″, să aibă o zi întreagă de autonomie și baterie schimbabilă de utilizator (Reg. (UE) 2023/1542 art. 11)?</w:t>
+              <w:t xml:space="preserve">Poate un obiect premium de ~63 × 71 × 23 mm, cu ecran AMOLED rotund de 1,75″ și o baterie de 750 mAh, să aibă o zi întreagă de autonomie și baterie schimbabilă de utilizator (Reg. (UE) 2023/1542 art. 11)?</w:t>
             </w:r>
           </w:p>
         </w:tc>
@@ -30996,7 +31022,7 @@
               <w:rPr>
                 <w:lang w:val="ro-RO"/>
               </w:rPr>
-              <w:t xml:space="preserve">Precizia touch pe ținte de 6,7 mm</w:t>
+              <w:t xml:space="preserve">Precizia touch pe ținte de 5,1 mm (tasta S; baseline X3: 6,7 mm pe M)</w:t>
             </w:r>
           </w:p>
         </w:tc>
@@ -33066,7 +33092,7 @@
               <w:rPr>
                 <w:lang w:val="ro-RO"/>
               </w:rPr>
-              <w:t xml:space="preserve">Autonomie în profil tipic (LiPo 1500 mAh)</w:t>
+              <w:t xml:space="preserve">Autonomie în profil tipic (SOUL S, LiPo 750 mAh; estimare ~27 h [estimare])</w:t>
             </w:r>
           </w:p>
         </w:tc>
@@ -33862,7 +33888,7 @@
               <w:rPr>
                 <w:lang w:val="ro-RO"/>
               </w:rPr>
-              <w:t xml:space="preserve">Model de laborator SOUL M validat la TRL 4 + Raport de validare TRL 4 (L14)</w:t>
+              <w:t xml:space="preserve">Model de laborator SOUL S validat la TRL 4 + Raport de validare TRL 4 (L14)</w:t>
             </w:r>
           </w:p>
         </w:tc>
@@ -33894,7 +33920,7 @@
               <w:rPr>
                 <w:lang w:val="ro-RO"/>
               </w:rPr>
-              <w:t xml:space="preserve">TRL 3: funcții pe componente separate; baseline fps/touch/WPM/offline/latență din X2–X6 </w:t>
+              <w:t xml:space="preserve">TRL 3: funcții pe componente separate; baseline fps/touch/WPM/offline/latență din X2–X6 pe prototipul M </w:t>
             </w:r>
             <w:r>
               <w:rPr>
@@ -34012,7 +34038,7 @@
               <w:rPr>
                 <w:lang w:val="ro-RO"/>
               </w:rPr>
-              <w:t xml:space="preserve">15 prototipuri SOUL M pre-serie validate la TRL 5 + Raport TRL 5 + raport de pre-testare EMC/RF (L22)</w:t>
+              <w:t xml:space="preserve">15 prototipuri SOUL S pre-serie validate la TRL 5 + Raport TRL 5 + raport de pre-testare EMC/RF (L22)</w:t>
             </w:r>
           </w:p>
         </w:tc>

</xml_diff>

<commit_message>
SOUL S: docs, factory model, PoC dossier and vault notes on size S (prototype M)
Co-Authored-By: Claude Opus 5.5 <noreply@anthropic.com>

Claude-Session: https://claude.ai/code/session_01Ck8guzeJBknbgPsaU2FiFA
</commit_message>
<xml_diff>
--- a/micul-smecher/investors/poc-1.1/dosar/draft/Anexa_16_Raport_Stiintific_SOUL_DRAFT.docx
+++ b/micul-smecher/investors/poc-1.1/dosar/draft/Anexa_16_Raport_Stiintific_SOUL_DRAFT.docx
@@ -6066,7 +6066,7 @@
           <w:bCs/>
           <w:lang w:val="ro-RO"/>
         </w:rPr>
-        <w:t xml:space="preserve">Firmware SoulOS (SoulOS 1.8.0, „Alive” 1.9.0 în lucru; C++17):</w:t>
+        <w:t xml:space="preserve">Firmware SoulOS 1.9.0 „Alive” (C++17; `env:lcd28` pe M, `env:amoled175` pe S):</w:t>
       </w:r>
       <w:r>
         <w:rPr>
@@ -7176,7 +7176,7 @@
         <w:rPr>
           <w:lang w:val="ro-RO"/>
         </w:rPr>
-        <w:t xml:space="preserve"> avem validarea analitică și verificarea software a funcțiilor critice, pe componente separate: randarea și logica UI (SoulOS 1.8.0, 198+ teste native, simulator), tastatura circulară (SoulOS pe web, model geometric), arhitectura cu AI-ul proprietarului și memoria portabilă (SOUL Cloud, 283 de teste), forma și CAD-ul corpului (D1–D7). </w:t>
+        <w:t xml:space="preserve"> avem validarea analitică și verificarea software a funcțiilor critice, pe componente separate: randarea și logica UI (SoulOS 1.9.0 „Alive”, 237+ teste native, simulator), tastatura circulară (SoulOS pe web, model geometric), arhitectura cu AI-ul proprietarului și memoria portabilă (SOUL Cloud, 283 de teste), forma și CAD-ul corpului (D1–D7). </w:t>
       </w:r>
       <w:r>
         <w:rPr>
@@ -7910,7 +7910,7 @@
               <w:rPr>
                 <w:lang w:val="ro-RO"/>
               </w:rPr>
-              <w:t xml:space="preserve">TRL DE PORNIRE — DE ATESTAT DUPĂ D8. Azi: validare analitică și verificare software a funcțiilor critice pe componente separate — D1 firmware SoulOS 1.8.0 cu 198+ teste native; D2 simulator cu cadre reale; D3 SOUL Cloud cu 283 de teste + SOUL Bridge; D4 SoulOS pe web; D5 modelul analitic al tastaturii; D6 forma finală MĂRGĂRITAR (randări, planșe, STL); D7 istoric git datat. Lipsește: D8, raportul de laborator TRL 3 pe placa 2.8C (X1–X8, măsurători fizice filmate) — </w:t>
+              <w:t xml:space="preserve">TRL DE PORNIRE — DE ATESTAT DUPĂ D8. Azi: validare analitică și verificare software a funcțiilor critice pe componente separate — D1 firmware SoulOS 1.9.0 „Alive” cu 237+ teste native; D2 simulator cu cadre reale; D3 SOUL Cloud cu 283 de teste + SOUL Bridge; D4 SoulOS pe web; D5 modelul analitic al tastaturii; D6 forma finală MĂRGĂRITAR (randări, planșe, STL); D7 istoric git datat. Lipsește: D8, raportul de laborator TRL 3 pe placa 2.8C (X1–X8, măsurători fizice filmate) — </w:t>
             </w:r>
             <w:r>
               <w:rPr>
@@ -8586,7 +8586,7 @@
               <w:rPr>
                 <w:lang w:val="ro-RO"/>
               </w:rPr>
-              <w:t xml:space="preserve">Firmware SoulOS 1.8.0 (lansat 04.10.2026, compilat fără avertismente): motorul ochilor (randare SDF, 120 de designuri, 31 de expresii, fiecare unitate primește o pereche din ID-ul cipului), IMU/giroscop, tastatura circulară, alarme, notițe, hărți/vreme/aplicații, SOUL Memory, comenzi vocale offline EN (ESP-SR), legătura Claude Hardware Buddy (BLE), protocolul SOUL Cloud; 198+ teste native trec pe PC (`pio test -e native`); build-uri `lcd28` (placa 2.8C, prototipul SOUL M), `lcd28_voice`, `amoled175` (placa AMOLED-1.75, SOUL S) și `sim`. Reproiectarea „SoulOS Alive” (aprobată 12.10.2026) e în lucru (1.9.0)</w:t>
+              <w:t xml:space="preserve">Firmware SoulOS 1.9.0 „Alive” (lansat 12.10.2026, compilat fără avertismente; imaginea de instalare `release/SOUL-2.8C-install.bin`): motorul ochilor (randare SDF, 120 de designuri, 31 de expresii, fiecare unitate primește o pereche din ID-ul cipului), IMU/giroscop, tastatura circulară, alarme, notițe, hărți/vreme/aplicații, SOUL Memory, comenzi vocale offline EN (ESP-SR), legătura Claude Hardware Buddy (BLE), protocolul SOUL Cloud; 237 de teste native trec pe PC (`pio test -e native`); build-uri `lcd28` (placa 2.8C, prototipul SOUL M), `lcd28_voice`, `amoled175` (placa AMOLED-1.75, SOUL S: profilul de densitate și toate ecranele Alive pe 466 px, 20–22.10.2026) și `sim`</w:t>
             </w:r>
           </w:p>
         </w:tc>
@@ -8650,7 +8650,7 @@
               <w:rPr>
                 <w:lang w:val="ro-RO"/>
               </w:rPr>
-              <w:t xml:space="preserve">depozit git, `firmware/` (README, PERF.md, BRINGUP.md); commit 95d8465 (1.8.0) </w:t>
+              <w:t xml:space="preserve">depozit git, `firmware/` (README, PERF.md, BRINGUP.md); commit 52689e4 (1.9.0); S: b3aee4c, b9c683d </w:t>
             </w:r>
             <w:r>
               <w:rPr>
@@ -8768,7 +8768,7 @@
               <w:rPr>
                 <w:lang w:val="ro-RO"/>
               </w:rPr>
-              <w:t xml:space="preserve">Simulator pe PC care rulează aceeași bibliotecă `lib/Suflet` ca placa și produce cadrele reale (clipuri: idle, boop, purr, dizzy, sleep…, tastatura, ecranele SoulOS la 480 px) + banc de performanță (`tools/perf_bench.py`: ≈ 30 fps estimat pe toate scenariile [E], de măsurat pe placă)</w:t>
+              <w:t xml:space="preserve">Simulator pe PC care rulează aceeași bibliotecă `lib/Suflet` ca placa și produce cadrele reale (clipuri: idle, boop, purr, dizzy, sleep…, tastatura, ecranele SoulOS la 480 px pe M și 466 px pe S) + banc de performanță (`tools/perf_bench.py`: ≈ 30 fps estimat pe toate scenariile [E], de măsurat pe placă)</w:t>
             </w:r>
           </w:p>
         </w:tc>
@@ -10214,7 +10214,7 @@
               <w:rPr>
                 <w:lang w:val="ro-RO"/>
               </w:rPr>
-              <w:t xml:space="preserve">Bring-up pe 2.8C: imaginea SoulOS 1.8.0 încărcată pe placă; ecran ST7701 RGB, touch GT911, IMU QMI8658, RTC, BLE (pașii din BRINGUP.md)</w:t>
+              <w:t xml:space="preserve">Bring-up pe 2.8C: imaginea SoulOS 1.9.0 (`release/SOUL-2.8C-install.bin`) încărcată pe placă; ecran ST7701 RGB, touch GT911, IMU QMI8658, RTC, BLE (pașii din BRINGUP.md)</w:t>
             </w:r>
           </w:p>
         </w:tc>
@@ -35354,7 +35354,7 @@
         <w:rPr>
           <w:lang w:val="ro-RO"/>
         </w:rPr>
-        <w:t xml:space="preserve">D1 — depozitul git, `micul-smecher/firmware/` (README, PERF.md, BRINGUP.md, test/: 198+ teste native), SoulOS 1.8.0, commit 95d8465 din 04.10.2026 </w:t>
+        <w:t xml:space="preserve">D1 — depozitul git, `micul-smecher/firmware/` (README, PERF.md, BRINGUP.md, test/: 237+ teste native), SoulOS 1.9.0 „Alive”, commit 52689e4 din 12.10.2026; profilul S: b3aee4c, b9c683d </w:t>
       </w:r>
       <w:r>
         <w:rPr>

</xml_diff>

<commit_message>
SOUL S: final consistency fixes
Co-Authored-By: Claude Opus 5.5 <noreply@anthropic.com>

Claude-Session: https://claude.ai/code/session_01Ck8guzeJBknbgPsaU2FiFA
</commit_message>
<xml_diff>
--- a/micul-smecher/investors/poc-1.1/dosar/draft/Anexa_16_Raport_Stiintific_SOUL_DRAFT.docx
+++ b/micul-smecher/investors/poc-1.1/dosar/draft/Anexa_16_Raport_Stiintific_SOUL_DRAFT.docx
@@ -6066,7 +6066,7 @@
           <w:bCs/>
           <w:lang w:val="ro-RO"/>
         </w:rPr>
-        <w:t xml:space="preserve">Firmware SoulOS 1.9.0 „Alive” (C++17; `env:lcd28` pe M, `env:amoled175` pe S):</w:t>
+        <w:t xml:space="preserve">Firmware SoulOS 1.9.1 „Alive” (C++17; `env:lcd28` pe M, `env:amoled175` pe S):</w:t>
       </w:r>
       <w:r>
         <w:rPr>
@@ -7176,7 +7176,7 @@
         <w:rPr>
           <w:lang w:val="ro-RO"/>
         </w:rPr>
-        <w:t xml:space="preserve"> avem validarea analitică și verificarea software a funcțiilor critice, pe componente separate: randarea și logica UI (SoulOS 1.9.0 „Alive”, 237+ teste native, simulator), tastatura circulară (SoulOS pe web, model geometric), arhitectura cu AI-ul proprietarului și memoria portabilă (SOUL Cloud, 283 de teste), forma și CAD-ul corpului (D1–D7). </w:t>
+        <w:t xml:space="preserve"> avem validarea analitică și verificarea software a funcțiilor critice, pe componente separate: randarea și logica UI (SoulOS 1.9.1 „Alive”, 245+ teste native, simulator), tastatura circulară (SoulOS pe web, model geometric), arhitectura cu AI-ul proprietarului și memoria portabilă (SOUL Cloud, 283 de teste), forma și CAD-ul corpului (D1–D7). </w:t>
       </w:r>
       <w:r>
         <w:rPr>
@@ -7910,7 +7910,7 @@
               <w:rPr>
                 <w:lang w:val="ro-RO"/>
               </w:rPr>
-              <w:t xml:space="preserve">TRL DE PORNIRE — DE ATESTAT DUPĂ D8. Azi: validare analitică și verificare software a funcțiilor critice pe componente separate — D1 firmware SoulOS 1.9.0 „Alive” cu 237+ teste native; D2 simulator cu cadre reale; D3 SOUL Cloud cu 283 de teste + SOUL Bridge; D4 SoulOS pe web; D5 modelul analitic al tastaturii; D6 forma finală MĂRGĂRITAR (randări, planșe, STL); D7 istoric git datat. Lipsește: D8, raportul de laborator TRL 3 pe placa 2.8C (X1–X8, măsurători fizice filmate) — </w:t>
+              <w:t xml:space="preserve">TRL DE PORNIRE — DE ATESTAT DUPĂ D8. Azi: validare analitică și verificare software a funcțiilor critice pe componente separate — D1 firmware SoulOS 1.9.1 „Alive” cu 245+ teste native; D2 simulator cu cadre reale; D3 SOUL Cloud cu 283 de teste + SOUL Bridge; D4 SoulOS pe web; D5 modelul analitic al tastaturii; D6 forma finală MĂRGĂRITAR (randări, planșe, STL); D7 istoric git datat. Lipsește: D8, raportul de laborator TRL 3 pe placa 2.8C (X1–X8, măsurători fizice filmate) — </w:t>
             </w:r>
             <w:r>
               <w:rPr>
@@ -8586,7 +8586,7 @@
               <w:rPr>
                 <w:lang w:val="ro-RO"/>
               </w:rPr>
-              <w:t xml:space="preserve">Firmware SoulOS 1.9.0 „Alive” (lansat 12.10.2026, compilat fără avertismente; imaginea de instalare `release/SOUL-2.8C-install.bin`): motorul ochilor (randare SDF, 120 de designuri, 31 de expresii, fiecare unitate primește o pereche din ID-ul cipului), IMU/giroscop, tastatura circulară, alarme, notițe, hărți/vreme/aplicații, SOUL Memory, comenzi vocale offline EN (ESP-SR), legătura Claude Hardware Buddy (BLE), protocolul SOUL Cloud; 237 de teste native trec pe PC (`pio test -e native`); build-uri `lcd28` (placa 2.8C, prototipul SOUL M), `lcd28_voice`, `amoled175` (placa AMOLED-1.75, SOUL S: profilul de densitate și toate ecranele Alive pe 466 px, 20–22.10.2026) și `sim`</w:t>
+              <w:t xml:space="preserve">Firmware SoulOS 1.9.1 „Alive” (Alive lansat în 1.9.0 pe 12.10.2026, commit 52689e4; 1.9.1 pe 22.10.2026, compilat fără avertismente; imaginile de instalare `release/SOUL-2.8C-install.bin` pentru M și `release/SOUL-1.75-install.bin` pentru S): motorul ochilor (randare SDF, 120 de designuri, 31 de expresii, fiecare unitate primește o pereche din ID-ul cipului), IMU/giroscop, tastatura circulară, alarme, notițe, hărți/vreme/aplicații, SOUL Memory, comenzi vocale offline EN (ESP-SR), legătura Claude Hardware Buddy (BLE), protocolul SOUL Cloud; 245 de teste native trec pe PC (`pio test -e native`); build-uri `lcd28` (placa 2.8C, prototipul SOUL M), `lcd28_voice`, `amoled175` (placa AMOLED-1.75, SOUL S: profilul de densitate și toate ecranele Alive pe 466 px, 20–22.10.2026) și `sim`</w:t>
             </w:r>
           </w:p>
         </w:tc>
@@ -8650,7 +8650,7 @@
               <w:rPr>
                 <w:lang w:val="ro-RO"/>
               </w:rPr>
-              <w:t xml:space="preserve">depozit git, `firmware/` (README, PERF.md, BRINGUP.md); commit 52689e4 (1.9.0); S: b3aee4c, b9c683d </w:t>
+              <w:t xml:space="preserve">depozit git, `firmware/` (README, PERF.md, BRINGUP.md); commit 52689e4 (1.9.0); S: b3aee4c, b9c683d; 1.9.1: fe9fbe4 </w:t>
             </w:r>
             <w:r>
               <w:rPr>
@@ -10214,7 +10214,7 @@
               <w:rPr>
                 <w:lang w:val="ro-RO"/>
               </w:rPr>
-              <w:t xml:space="preserve">Bring-up pe 2.8C: imaginea SoulOS 1.9.0 (`release/SOUL-2.8C-install.bin`) încărcată pe placă; ecran ST7701 RGB, touch GT911, IMU QMI8658, RTC, BLE (pașii din BRINGUP.md)</w:t>
+              <w:t xml:space="preserve">Bring-up pe 2.8C: imaginea SoulOS 1.9.1 (`release/SOUL-2.8C-install.bin`) încărcată pe placă; ecran ST7701 RGB, touch GT911, IMU QMI8658, RTC, BLE (pașii din BRINGUP.md)</w:t>
             </w:r>
           </w:p>
         </w:tc>
@@ -35354,7 +35354,7 @@
         <w:rPr>
           <w:lang w:val="ro-RO"/>
         </w:rPr>
-        <w:t xml:space="preserve">D1 — depozitul git, `micul-smecher/firmware/` (README, PERF.md, BRINGUP.md, test/: 237+ teste native), SoulOS 1.9.0 „Alive”, commit 52689e4 din 12.10.2026; profilul S: b3aee4c, b9c683d </w:t>
+        <w:t xml:space="preserve">D1 — depozitul git, `micul-smecher/firmware/` (README, PERF.md, BRINGUP.md, test/: 245+ teste native), SoulOS 1.9.1 „Alive”, commit fe9fbe4 din 22.10.2026 (Alive 1.9.0: commit 52689e4 din 12.10.2026); profilul S: b3aee4c, b9c683d </w:t>
       </w:r>
       <w:r>
         <w:rPr>

</xml_diff>